<commit_message>
Update CV publication details
</commit_message>
<xml_diff>
--- a/Yuanyuan_Hu_CV.docx
+++ b/Yuanyuan_Hu_CV.docx
@@ -616,7 +616,7 @@
     </w:p>
     <w:p>
       <w:pPr>
-        <w:spacing w:before="0" w:after="40" w:line="245" w:lineRule="auto"/>
+        <w:spacing w:before="0" w:after="40" w:line="254" w:lineRule="auto"/>
         <w:ind w:left="288" w:hanging="288"/>
       </w:pPr>
       <w:r>
@@ -647,7 +647,7 @@
           <w:color w:val="262A2E"/>
           <w:sz w:val="16"/>
         </w:rPr>
-        <w:t>, Jie Xiang, Yuening Jin, Qingchen Fan, Changshuo Wang, Yihan Wu, Dang Zheng, Bowen Hu, Tingyong Feng, Yuan Zhou &amp; Zhiyi Chen</w:t>
+        <w:t>, Jie Xiang, Yuening Jin, Qingchen Fan, Changshuo Wang, Yihan Wu, Dang Zheng, Yancheng Tang, Wei Li, Bowen Hu, Tingyong Feng, Yuan Zhou &amp; Zhiyi Chen</w:t>
       </w:r>
       <w:r>
         <w:rPr>
@@ -657,7 +657,7 @@
           <w:color w:val="262A2E"/>
           <w:sz w:val="16"/>
         </w:rPr>
-        <w:t xml:space="preserve"> (2025). </w:t>
+        <w:t xml:space="preserve"> (2026). </w:t>
       </w:r>
       <w:r>
         <w:rPr>
@@ -667,7 +667,7 @@
           <w:color w:val="262A2E"/>
           <w:sz w:val="16"/>
         </w:rPr>
-        <w:t xml:space="preserve">Shared Neurogenetic Substrates of Non-planning Impulsivity and Procrastination. </w:t>
+        <w:t xml:space="preserve">Shared neurogenetic substrates of nonplanning impulsivity and procrastination. </w:t>
       </w:r>
       <w:r>
         <w:rPr>
@@ -677,7 +677,7 @@
           <w:color w:val="262A2E"/>
           <w:sz w:val="16"/>
         </w:rPr>
-        <w:t>Proceedings of the National Academy of Sciences (PNAS)</w:t>
+        <w:t>Proceedings of the National Academy of Sciences</w:t>
       </w:r>
       <w:r>
         <w:rPr>
@@ -687,7 +687,7 @@
           <w:color w:val="262A2E"/>
           <w:sz w:val="16"/>
         </w:rPr>
-        <w:t>, provisionally approved for publication; Tracking #: 2026-05127R</w:t>
+        <w:t>, 123(28), e2605127123</w:t>
       </w:r>
       <w:r>
         <w:rPr>
@@ -699,10 +699,30 @@
         </w:rPr>
         <w:t xml:space="preserve">. </w:t>
       </w:r>
+      <w:r>
+        <w:rPr>
+          <w:rFonts w:ascii="Calibri" w:hAnsi="Calibri"/>
+          <w:b w:val="0"/>
+          <w:i w:val="0"/>
+          <w:color w:val="5F666E"/>
+          <w:sz w:val="14"/>
+        </w:rPr>
+        <w:t xml:space="preserve">[Independent first author] </w:t>
+      </w:r>
+      <w:r>
+        <w:rPr>
+          <w:rFonts w:ascii="Calibri" w:hAnsi="Calibri"/>
+          <w:b w:val="0"/>
+          <w:i w:val="0"/>
+          <w:color w:val="5F666E"/>
+          <w:sz w:val="14"/>
+        </w:rPr>
+        <w:t>[SCI · Q1 · 5-year IF 10.6]</w:t>
+      </w:r>
     </w:p>
     <w:p>
       <w:pPr>
-        <w:spacing w:before="0" w:after="40" w:line="245" w:lineRule="auto"/>
+        <w:spacing w:before="0" w:after="40" w:line="254" w:lineRule="auto"/>
         <w:ind w:left="288" w:hanging="288"/>
       </w:pPr>
       <w:r>
@@ -773,7 +793,7 @@
           <w:color w:val="262A2E"/>
           <w:sz w:val="16"/>
         </w:rPr>
-        <w:t>, in press</w:t>
+        <w:t>, 1–15</w:t>
       </w:r>
       <w:r>
         <w:rPr>
@@ -791,14 +811,24 @@
           <w:b w:val="0"/>
           <w:i w:val="0"/>
           <w:color w:val="5F666E"/>
-          <w:sz w:val="15"/>
+          <w:sz w:val="14"/>
         </w:rPr>
-        <w:t>[SCI · Q1 · 5-year IF 11.8]</w:t>
+        <w:t xml:space="preserve">[Co-first author, 3 first authors] </w:t>
+      </w:r>
+      <w:r>
+        <w:rPr>
+          <w:rFonts w:ascii="Calibri" w:hAnsi="Calibri"/>
+          <w:b w:val="0"/>
+          <w:i w:val="0"/>
+          <w:color w:val="5F666E"/>
+          <w:sz w:val="14"/>
+        </w:rPr>
+        <w:t>[SCI · Q1 · 5-year IF 12.2]</w:t>
       </w:r>
     </w:p>
     <w:p>
       <w:pPr>
-        <w:spacing w:before="0" w:after="40" w:line="245" w:lineRule="auto"/>
+        <w:spacing w:before="0" w:after="40" w:line="254" w:lineRule="auto"/>
         <w:ind w:left="288" w:hanging="288"/>
       </w:pPr>
       <w:r>
@@ -897,14 +927,24 @@
           <w:b w:val="0"/>
           <w:i w:val="0"/>
           <w:color w:val="5F666E"/>
-          <w:sz w:val="15"/>
+          <w:sz w:val="14"/>
         </w:rPr>
-        <w:t>[SCI · Q1 · 5-year IF 16.1]</w:t>
+        <w:t xml:space="preserve">[Co-first author, 5 first authors] </w:t>
+      </w:r>
+      <w:r>
+        <w:rPr>
+          <w:rFonts w:ascii="Calibri" w:hAnsi="Calibri"/>
+          <w:b w:val="0"/>
+          <w:i w:val="0"/>
+          <w:color w:val="5F666E"/>
+          <w:sz w:val="14"/>
+        </w:rPr>
+        <w:t>[SCI · Q1 · 5-year IF 18.9]</w:t>
       </w:r>
     </w:p>
     <w:p>
       <w:pPr>
-        <w:spacing w:before="0" w:after="40" w:line="245" w:lineRule="auto"/>
+        <w:spacing w:before="0" w:after="40" w:line="254" w:lineRule="auto"/>
         <w:ind w:left="288" w:hanging="288"/>
       </w:pPr>
       <w:r>
@@ -993,14 +1033,24 @@
           <w:b w:val="0"/>
           <w:i w:val="0"/>
           <w:color w:val="5F666E"/>
-          <w:sz w:val="15"/>
+          <w:sz w:val="14"/>
         </w:rPr>
-        <w:t>[SSCI · Q1 · 5-year IF 3.5]</w:t>
+        <w:t xml:space="preserve">[Co-first author, 2 first authors] </w:t>
+      </w:r>
+      <w:r>
+        <w:rPr>
+          <w:rFonts w:ascii="Calibri" w:hAnsi="Calibri"/>
+          <w:b w:val="0"/>
+          <w:i w:val="0"/>
+          <w:color w:val="5F666E"/>
+          <w:sz w:val="14"/>
+        </w:rPr>
+        <w:t>[SSCI · Q1 · 5-year IF 4.5]</w:t>
       </w:r>
     </w:p>
     <w:p>
       <w:pPr>
-        <w:spacing w:before="0" w:after="40" w:line="245" w:lineRule="auto"/>
+        <w:spacing w:before="0" w:after="40" w:line="254" w:lineRule="auto"/>
         <w:ind w:left="288" w:hanging="288"/>
       </w:pPr>
       <w:r>
@@ -1089,9 +1139,19 @@
           <w:b w:val="0"/>
           <w:i w:val="0"/>
           <w:color w:val="5F666E"/>
-          <w:sz w:val="15"/>
+          <w:sz w:val="14"/>
         </w:rPr>
-        <w:t>[SCI · Q2 · 5-year IF 2.9]</w:t>
+        <w:t xml:space="preserve">[Co-first author, 2 first authors] </w:t>
+      </w:r>
+      <w:r>
+        <w:rPr>
+          <w:rFonts w:ascii="Calibri" w:hAnsi="Calibri"/>
+          <w:b w:val="0"/>
+          <w:i w:val="0"/>
+          <w:color w:val="5F666E"/>
+          <w:sz w:val="14"/>
+        </w:rPr>
+        <w:t>[SCI · Q2 · 5-year IF 3.1]</w:t>
       </w:r>
     </w:p>
     <w:p>
@@ -1111,7 +1171,7 @@
     </w:p>
     <w:p>
       <w:pPr>
-        <w:spacing w:before="0" w:after="40" w:line="245" w:lineRule="auto"/>
+        <w:spacing w:before="0" w:after="40" w:line="254" w:lineRule="auto"/>
         <w:ind w:left="288" w:hanging="288"/>
       </w:pPr>
       <w:r>
@@ -1210,14 +1270,14 @@
           <w:b w:val="0"/>
           <w:i w:val="0"/>
           <w:color w:val="5F666E"/>
-          <w:sz w:val="15"/>
+          <w:sz w:val="14"/>
         </w:rPr>
         <w:t>[SCI · Q1 · 5-year IF 16.3]</w:t>
       </w:r>
     </w:p>
     <w:p>
       <w:pPr>
-        <w:spacing w:before="0" w:after="40" w:line="245" w:lineRule="auto"/>
+        <w:spacing w:before="0" w:after="40" w:line="254" w:lineRule="auto"/>
         <w:ind w:left="288" w:hanging="288"/>
       </w:pPr>
       <w:r>
@@ -1316,14 +1376,14 @@
           <w:b w:val="0"/>
           <w:i w:val="0"/>
           <w:color w:val="5F666E"/>
-          <w:sz w:val="15"/>
+          <w:sz w:val="14"/>
         </w:rPr>
         <w:t>[SCI · Q1 · 5-year IF 6.3]</w:t>
       </w:r>
     </w:p>
     <w:p>
       <w:pPr>
-        <w:spacing w:before="0" w:after="40" w:line="245" w:lineRule="auto"/>
+        <w:spacing w:before="0" w:after="40" w:line="254" w:lineRule="auto"/>
         <w:ind w:left="288" w:hanging="288"/>
       </w:pPr>
       <w:r>
@@ -1422,7 +1482,7 @@
           <w:b w:val="0"/>
           <w:i w:val="0"/>
           <w:color w:val="5F666E"/>
-          <w:sz w:val="15"/>
+          <w:sz w:val="14"/>
         </w:rPr>
         <w:t>[Preprint]</w:t>
       </w:r>
@@ -1437,9 +1497,9 @@
           <w:b w:val="0"/>
           <w:i/>
           <w:color w:val="5F666E"/>
-          <w:sz w:val="15"/>
+          <w:sz w:val="14"/>
         </w:rPr>
-        <w:t>#  indicates equal contribution.</w:t>
+        <w:t># indicates equal contribution.</w:t>
       </w:r>
     </w:p>
     <w:sectPr>

</xml_diff>

<commit_message>
Add DOI links and extended CV
</commit_message>
<xml_diff>
--- a/Yuanyuan_Hu_CV.docx
+++ b/Yuanyuan_Hu_CV.docx
@@ -1502,6 +1502,22 @@
         <w:t># indicates equal contribution.</w:t>
       </w:r>
     </w:p>
+    <w:p>
+      <w:pPr>
+        <w:spacing w:before="40" w:after="0" w:line="240" w:lineRule="auto"/>
+        <w:jc w:val="center"/>
+      </w:pPr>
+      <w:r>
+        <w:rPr>
+          <w:rFonts w:ascii="Calibri" w:hAnsi="Calibri"/>
+          <w:b w:val="0"/>
+          <w:i w:val="0"/>
+          <w:color w:val="5F666E"/>
+          <w:sz w:val="13"/>
+        </w:rPr>
+        <w:t>Latest CV: yuanyuan-hu0319.github.io/cv-site/</w:t>
+      </w:r>
+    </w:p>
     <w:sectPr>
       <w:pgSz w:w="12240" w:h="15840"/>
       <w:pgMar w:top="576" w:right="792" w:bottom="504" w:left="792" w:header="720" w:footer="720" w:gutter="0"/>

</xml_diff>

<commit_message>
Justify CV body text
</commit_message>
<xml_diff>
--- a/Yuanyuan_Hu_CV.docx
+++ b/Yuanyuan_Hu_CV.docx
@@ -69,6 +69,7 @@
     <w:p>
       <w:pPr>
         <w:spacing w:before="100" w:after="40" w:line="240" w:lineRule="auto"/>
+        <w:jc w:val="both"/>
         <w:pBdr>
           <w:bottom w:val="single" w:sz="6" w:space="1" w:color="C9D3E0"/>
         </w:pBdr>
@@ -87,6 +88,7 @@
     <w:p>
       <w:pPr>
         <w:spacing w:before="0" w:after="0" w:line="240" w:lineRule="auto"/>
+        <w:jc w:val="both"/>
       </w:pPr>
       <w:r>
         <w:rPr>
@@ -112,6 +114,7 @@
     <w:p>
       <w:pPr>
         <w:spacing w:before="0" w:after="0" w:line="240" w:lineRule="auto"/>
+        <w:jc w:val="both"/>
       </w:pPr>
       <w:r>
         <w:rPr>
@@ -137,6 +140,7 @@
     <w:p>
       <w:pPr>
         <w:spacing w:before="0" w:after="0" w:line="240" w:lineRule="auto"/>
+        <w:jc w:val="both"/>
       </w:pPr>
       <w:r>
         <w:rPr>
@@ -152,6 +156,7 @@
     <w:p>
       <w:pPr>
         <w:spacing w:before="0" w:after="60" w:line="240" w:lineRule="auto"/>
+        <w:jc w:val="both"/>
       </w:pPr>
       <w:r>
         <w:rPr>
@@ -167,6 +172,7 @@
     <w:p>
       <w:pPr>
         <w:spacing w:before="0" w:after="0" w:line="240" w:lineRule="auto"/>
+        <w:jc w:val="both"/>
       </w:pPr>
       <w:r>
         <w:rPr>
@@ -192,6 +198,7 @@
     <w:p>
       <w:pPr>
         <w:spacing w:before="0" w:after="0" w:line="240" w:lineRule="auto"/>
+        <w:jc w:val="both"/>
       </w:pPr>
       <w:r>
         <w:rPr>
@@ -217,6 +224,7 @@
     <w:p>
       <w:pPr>
         <w:spacing w:before="0" w:after="0" w:line="240" w:lineRule="auto"/>
+        <w:jc w:val="both"/>
       </w:pPr>
       <w:r>
         <w:rPr>
@@ -232,6 +240,7 @@
     <w:p>
       <w:pPr>
         <w:spacing w:before="0" w:after="60" w:line="240" w:lineRule="auto"/>
+        <w:jc w:val="both"/>
       </w:pPr>
       <w:r>
         <w:rPr>
@@ -247,6 +256,7 @@
     <w:p>
       <w:pPr>
         <w:spacing w:before="0" w:after="0" w:line="240" w:lineRule="auto"/>
+        <w:jc w:val="both"/>
       </w:pPr>
       <w:r>
         <w:rPr>
@@ -272,6 +282,7 @@
     <w:p>
       <w:pPr>
         <w:spacing w:before="0" w:after="0" w:line="240" w:lineRule="auto"/>
+        <w:jc w:val="both"/>
       </w:pPr>
       <w:r>
         <w:rPr>
@@ -297,6 +308,7 @@
     <w:p>
       <w:pPr>
         <w:spacing w:before="0" w:after="0" w:line="240" w:lineRule="auto"/>
+        <w:jc w:val="both"/>
       </w:pPr>
       <w:r>
         <w:rPr>
@@ -312,6 +324,7 @@
     <w:p>
       <w:pPr>
         <w:spacing w:before="0" w:after="60" w:line="240" w:lineRule="auto"/>
+        <w:jc w:val="both"/>
       </w:pPr>
       <w:r>
         <w:rPr>
@@ -327,6 +340,7 @@
     <w:p>
       <w:pPr>
         <w:spacing w:before="100" w:after="40" w:line="240" w:lineRule="auto"/>
+        <w:jc w:val="both"/>
         <w:pBdr>
           <w:bottom w:val="single" w:sz="6" w:space="1" w:color="C9D3E0"/>
         </w:pBdr>
@@ -345,6 +359,7 @@
     <w:p>
       <w:pPr>
         <w:spacing w:before="0" w:after="40" w:line="240" w:lineRule="auto"/>
+        <w:jc w:val="both"/>
       </w:pPr>
       <w:r>
         <w:rPr>
@@ -360,6 +375,7 @@
     <w:p>
       <w:pPr>
         <w:spacing w:before="100" w:after="40" w:line="240" w:lineRule="auto"/>
+        <w:jc w:val="both"/>
         <w:pBdr>
           <w:bottom w:val="single" w:sz="6" w:space="1" w:color="C9D3E0"/>
         </w:pBdr>
@@ -378,6 +394,7 @@
     <w:p>
       <w:pPr>
         <w:spacing w:before="0" w:after="40" w:line="252" w:lineRule="auto"/>
+        <w:jc w:val="both"/>
       </w:pPr>
       <w:r>
         <w:rPr>
@@ -393,6 +410,7 @@
     <w:p>
       <w:pPr>
         <w:spacing w:before="100" w:after="40" w:line="240" w:lineRule="auto"/>
+        <w:jc w:val="both"/>
         <w:pBdr>
           <w:bottom w:val="single" w:sz="6" w:space="1" w:color="C9D3E0"/>
         </w:pBdr>
@@ -411,6 +429,7 @@
     <w:p>
       <w:pPr>
         <w:spacing w:before="0" w:after="40" w:line="240" w:lineRule="auto"/>
+        <w:jc w:val="both"/>
       </w:pPr>
       <w:r>
         <w:rPr>
@@ -436,6 +455,7 @@
     <w:p>
       <w:pPr>
         <w:spacing w:before="100" w:after="40" w:line="240" w:lineRule="auto"/>
+        <w:jc w:val="both"/>
         <w:pBdr>
           <w:bottom w:val="single" w:sz="6" w:space="1" w:color="C9D3E0"/>
         </w:pBdr>
@@ -455,6 +475,7 @@
       <w:pPr>
         <w:spacing w:before="0" w:after="20" w:line="245" w:lineRule="auto"/>
         <w:ind w:left="605" w:hanging="605"/>
+        <w:jc w:val="both"/>
       </w:pPr>
       <w:r>
         <w:rPr>
@@ -481,6 +502,7 @@
       <w:pPr>
         <w:spacing w:before="0" w:after="20" w:line="245" w:lineRule="auto"/>
         <w:ind w:left="605" w:hanging="605"/>
+        <w:jc w:val="both"/>
       </w:pPr>
       <w:r>
         <w:rPr>
@@ -507,6 +529,7 @@
       <w:pPr>
         <w:spacing w:before="0" w:after="20" w:line="245" w:lineRule="auto"/>
         <w:ind w:left="605" w:hanging="605"/>
+        <w:jc w:val="both"/>
       </w:pPr>
       <w:r>
         <w:rPr>
@@ -533,6 +556,7 @@
       <w:pPr>
         <w:spacing w:before="0" w:after="20" w:line="245" w:lineRule="auto"/>
         <w:ind w:left="605" w:hanging="605"/>
+        <w:jc w:val="both"/>
       </w:pPr>
       <w:r>
         <w:rPr>
@@ -559,6 +583,7 @@
       <w:pPr>
         <w:spacing w:before="0" w:after="20" w:line="245" w:lineRule="auto"/>
         <w:ind w:left="605" w:hanging="605"/>
+        <w:jc w:val="both"/>
       </w:pPr>
       <w:r>
         <w:rPr>
@@ -584,6 +609,7 @@
     <w:p>
       <w:pPr>
         <w:spacing w:before="100" w:after="40" w:line="240" w:lineRule="auto"/>
+        <w:jc w:val="both"/>
         <w:pBdr>
           <w:bottom w:val="single" w:sz="6" w:space="1" w:color="C9D3E0"/>
         </w:pBdr>
@@ -602,6 +628,7 @@
     <w:p>
       <w:pPr>
         <w:spacing w:before="20" w:after="20" w:line="240" w:lineRule="auto"/>
+        <w:jc w:val="both"/>
       </w:pPr>
       <w:r>
         <w:rPr>
@@ -618,6 +645,7 @@
       <w:pPr>
         <w:spacing w:before="0" w:after="40" w:line="254" w:lineRule="auto"/>
         <w:ind w:left="288" w:hanging="288"/>
+        <w:jc w:val="both"/>
       </w:pPr>
       <w:r>
         <w:rPr>
@@ -724,6 +752,7 @@
       <w:pPr>
         <w:spacing w:before="0" w:after="40" w:line="254" w:lineRule="auto"/>
         <w:ind w:left="288" w:hanging="288"/>
+        <w:jc w:val="both"/>
       </w:pPr>
       <w:r>
         <w:rPr>
@@ -830,6 +859,7 @@
       <w:pPr>
         <w:spacing w:before="0" w:after="40" w:line="254" w:lineRule="auto"/>
         <w:ind w:left="288" w:hanging="288"/>
+        <w:jc w:val="both"/>
       </w:pPr>
       <w:r>
         <w:rPr>
@@ -946,6 +976,7 @@
       <w:pPr>
         <w:spacing w:before="0" w:after="40" w:line="254" w:lineRule="auto"/>
         <w:ind w:left="288" w:hanging="288"/>
+        <w:jc w:val="both"/>
       </w:pPr>
       <w:r>
         <w:rPr>
@@ -1052,6 +1083,7 @@
       <w:pPr>
         <w:spacing w:before="0" w:after="40" w:line="254" w:lineRule="auto"/>
         <w:ind w:left="288" w:hanging="288"/>
+        <w:jc w:val="both"/>
       </w:pPr>
       <w:r>
         <w:rPr>
@@ -1157,6 +1189,7 @@
     <w:p>
       <w:pPr>
         <w:spacing w:before="40" w:after="20" w:line="240" w:lineRule="auto"/>
+        <w:jc w:val="both"/>
       </w:pPr>
       <w:r>
         <w:rPr>
@@ -1173,6 +1206,7 @@
       <w:pPr>
         <w:spacing w:before="0" w:after="40" w:line="254" w:lineRule="auto"/>
         <w:ind w:left="288" w:hanging="288"/>
+        <w:jc w:val="both"/>
       </w:pPr>
       <w:r>
         <w:rPr>
@@ -1279,6 +1313,7 @@
       <w:pPr>
         <w:spacing w:before="0" w:after="40" w:line="254" w:lineRule="auto"/>
         <w:ind w:left="288" w:hanging="288"/>
+        <w:jc w:val="both"/>
       </w:pPr>
       <w:r>
         <w:rPr>
@@ -1385,6 +1420,7 @@
       <w:pPr>
         <w:spacing w:before="0" w:after="40" w:line="254" w:lineRule="auto"/>
         <w:ind w:left="288" w:hanging="288"/>
+        <w:jc w:val="both"/>
       </w:pPr>
       <w:r>
         <w:rPr>
@@ -1490,6 +1526,7 @@
     <w:p>
       <w:pPr>
         <w:spacing w:before="40" w:after="0" w:line="240" w:lineRule="auto"/>
+        <w:jc w:val="both"/>
       </w:pPr>
       <w:r>
         <w:rPr>

</xml_diff>

<commit_message>
Optimize one-page and extended CV layouts
</commit_message>
<xml_diff>
--- a/Yuanyuan_Hu_CV.docx
+++ b/Yuanyuan_Hu_CV.docx
@@ -4,47 +4,77 @@
   <w:body>
     <w:p>
       <w:pPr>
-        <w:spacing w:before="0" w:after="0" w:line="240" w:lineRule="auto"/>
+        <w:pStyle w:val="Title"/>
+        <w:spacing w:before="0"/>
         <w:jc w:val="center"/>
+        <w:pBdr>
+          <w:top w:val="nil"/>
+          <w:left w:val="nil"/>
+          <w:bottom w:val="nil"/>
+          <w:right w:val="nil"/>
+          <w:between w:val="nil"/>
+        </w:pBdr>
       </w:pPr>
       <w:r>
         <w:rPr>
-          <w:rFonts w:ascii="Cambria" w:hAnsi="Cambria"/>
+          <w:rFonts w:ascii="Aptos Display" w:hAnsi="Aptos Display"/>
           <w:b/>
           <w:i w:val="0"/>
-          <w:color w:val="1E3A5F"/>
-          <w:sz w:val="38"/>
+          <w:color w:val="193654"/>
+          <w:sz w:val="42"/>
         </w:rPr>
         <w:t>Yuanyuan Hu</w:t>
       </w:r>
     </w:p>
     <w:p>
       <w:pPr>
-        <w:spacing w:before="0" w:after="0" w:line="240" w:lineRule="auto"/>
+        <w:keepLines w:val="0"/>
+        <w:spacing w:before="0" w:after="20" w:line="240" w:lineRule="auto"/>
         <w:jc w:val="center"/>
       </w:pPr>
       <w:r>
         <w:rPr>
-          <w:rFonts w:ascii="Cambria" w:hAnsi="Cambria"/>
-          <w:b w:val="0"/>
-          <w:i/>
-          <w:color w:val="3A5E8C"/>
+          <w:rFonts w:ascii="Aptos Display" w:hAnsi="Aptos Display"/>
+          <w:b/>
+          <w:i w:val="0"/>
+          <w:color w:val="1E6A73"/>
           <w:sz w:val="20"/>
         </w:rPr>
         <w:t>PhD Student, Cognitive Neuroscience</w:t>
       </w:r>
+      <w:r>
+        <w:rPr>
+          <w:rFonts w:ascii="Aptos" w:hAnsi="Aptos"/>
+          <w:b w:val="0"/>
+          <w:i w:val="0"/>
+          <w:color w:val="D8E0E5"/>
+          <w:sz w:val="18"/>
+        </w:rPr>
+        <w:t xml:space="preserve">  |  </w:t>
+      </w:r>
+      <w:r>
+        <w:rPr>
+          <w:rFonts w:ascii="Aptos" w:hAnsi="Aptos"/>
+          <w:b w:val="0"/>
+          <w:i w:val="0"/>
+          <w:color w:val="5C646D"/>
+          <w:sz w:val="18"/>
+        </w:rPr>
+        <w:t>Beijing, China 100101</w:t>
+      </w:r>
     </w:p>
     <w:p>
       <w:pPr>
-        <w:spacing w:before="0" w:after="0" w:line="240" w:lineRule="auto"/>
+        <w:keepLines w:val="0"/>
+        <w:spacing w:before="0" w:after="20" w:line="240" w:lineRule="auto"/>
         <w:jc w:val="center"/>
       </w:pPr>
       <w:r>
         <w:rPr>
-          <w:rFonts w:ascii="Calibri" w:hAnsi="Calibri"/>
+          <w:rFonts w:ascii="Aptos" w:hAnsi="Aptos"/>
           <w:b w:val="0"/>
           <w:i w:val="0"/>
-          <w:color w:val="5F666E"/>
+          <w:color w:val="5C646D"/>
           <w:sz w:val="17"/>
         </w:rPr>
         <w:t>State Key Laboratory of Cognitive Science and Mental Health, Institute of Psychology, Chinese Academy of Sciences</w:t>
@@ -52,447 +82,489 @@
     </w:p>
     <w:p>
       <w:pPr>
-        <w:spacing w:before="0" w:after="20" w:line="240" w:lineRule="auto"/>
+        <w:keepLines w:val="0"/>
+        <w:spacing w:before="0" w:after="60" w:line="240" w:lineRule="auto"/>
         <w:jc w:val="center"/>
+      </w:pPr>
+      <w:hyperlink r:id="rId10">
+        <w:r>
+          <w:rPr>
+            <w:rFonts w:ascii="Aptos" w:hAnsi="Aptos"/>
+            <w:color w:val="1E6A73"/>
+            <w:sz w:val="17"/>
+            <w:szCs w:val="17"/>
+            <w:b/>
+            <w:u w:val="single"/>
+          </w:rPr>
+          <w:t>Email</w:t>
+        </w:r>
+      </w:hyperlink>
+      <w:r>
+        <w:rPr>
+          <w:rFonts w:ascii="Aptos" w:hAnsi="Aptos"/>
+          <w:b w:val="0"/>
+          <w:i w:val="0"/>
+          <w:color w:val="D8E0E5"/>
+          <w:sz w:val="16"/>
+        </w:rPr>
+        <w:t xml:space="preserve">   |   </w:t>
+      </w:r>
+      <w:hyperlink r:id="rId11">
+        <w:r>
+          <w:rPr>
+            <w:rFonts w:ascii="Aptos" w:hAnsi="Aptos"/>
+            <w:color w:val="1E6A73"/>
+            <w:sz w:val="17"/>
+            <w:szCs w:val="17"/>
+            <w:b/>
+            <w:u w:val="single"/>
+          </w:rPr>
+          <w:t>Website</w:t>
+        </w:r>
+      </w:hyperlink>
+      <w:r>
+        <w:rPr>
+          <w:rFonts w:ascii="Aptos" w:hAnsi="Aptos"/>
+          <w:b w:val="0"/>
+          <w:i w:val="0"/>
+          <w:color w:val="D8E0E5"/>
+          <w:sz w:val="16"/>
+        </w:rPr>
+        <w:t xml:space="preserve">   |   </w:t>
+      </w:r>
+      <w:hyperlink r:id="rId12">
+        <w:r>
+          <w:rPr>
+            <w:rFonts w:ascii="Aptos" w:hAnsi="Aptos"/>
+            <w:color w:val="1E6A73"/>
+            <w:sz w:val="17"/>
+            <w:szCs w:val="17"/>
+            <w:b/>
+            <w:u w:val="single"/>
+          </w:rPr>
+          <w:t>ORCID</w:t>
+        </w:r>
+      </w:hyperlink>
+      <w:r>
+        <w:rPr>
+          <w:rFonts w:ascii="Aptos" w:hAnsi="Aptos"/>
+          <w:b w:val="0"/>
+          <w:i w:val="0"/>
+          <w:color w:val="D8E0E5"/>
+          <w:sz w:val="16"/>
+        </w:rPr>
+        <w:t xml:space="preserve">   |   </w:t>
+      </w:r>
+      <w:hyperlink r:id="rId13">
+        <w:r>
+          <w:rPr>
+            <w:rFonts w:ascii="Aptos" w:hAnsi="Aptos"/>
+            <w:color w:val="1E6A73"/>
+            <w:sz w:val="17"/>
+            <w:szCs w:val="17"/>
+            <w:b/>
+            <w:u w:val="single"/>
+          </w:rPr>
+          <w:t>ResearchGate</w:t>
+        </w:r>
+      </w:hyperlink>
+    </w:p>
+    <w:p>
+      <w:pPr>
+        <w:pStyle w:val="CVSection"/>
+        <w:spacing w:before="40"/>
+        <w:jc w:val="left"/>
       </w:pPr>
       <w:r>
         <w:rPr>
-          <w:rFonts w:ascii="Calibri" w:hAnsi="Calibri"/>
-          <w:b w:val="0"/>
+          <w:rFonts w:ascii="Aptos Display" w:hAnsi="Aptos Display"/>
+          <w:b/>
           <w:i w:val="0"/>
-          <w:color w:val="3A5E8C"/>
-          <w:sz w:val="17"/>
+          <w:color w:val="193654"/>
+          <w:sz w:val="20"/>
         </w:rPr>
-        <w:t>huyy@psych.ac.cn  ·  orcid.org/0000-0001-9019-6198  ·  researchgate.net/profile/Yuanyuan-Hu-27  ·  Beijing, China 100101</w:t>
+        <w:t>RESEARCH PROFILE</w:t>
       </w:r>
     </w:p>
     <w:p>
       <w:pPr>
-        <w:spacing w:before="100" w:after="40" w:line="240" w:lineRule="auto"/>
+        <w:keepLines w:val="0"/>
+        <w:spacing w:before="0" w:after="60" w:line="269" w:lineRule="auto"/>
         <w:jc w:val="both"/>
-        <w:pBdr>
-          <w:bottom w:val="single" w:sz="6" w:space="1" w:color="C9D3E0"/>
-        </w:pBdr>
       </w:pPr>
       <w:r>
         <w:rPr>
-          <w:rFonts w:ascii="Cambria" w:hAnsi="Cambria"/>
+          <w:rFonts w:ascii="Aptos" w:hAnsi="Aptos"/>
+          <w:b w:val="0"/>
+          <w:i w:val="0"/>
+          <w:color w:val="20252B"/>
+          <w:sz w:val="18"/>
+        </w:rPr>
+        <w:t>I study how genetic and environmental influences shape individual differences in brain structure and networks, with a focus on anxiety, depression, self-regulation, and transdiagnostic mental-health risk. My work combines twin designs, structural and functional neuroimaging, behavioral genetics, normative modeling, and connectome-based analyses.</w:t>
+      </w:r>
+    </w:p>
+    <w:p>
+      <w:pPr>
+        <w:pStyle w:val="CVSection"/>
+        <w:spacing w:before="60"/>
+        <w:jc w:val="left"/>
+      </w:pPr>
+      <w:r>
+        <w:rPr>
+          <w:rFonts w:ascii="Aptos Display" w:hAnsi="Aptos Display"/>
           <w:b/>
           <w:i w:val="0"/>
-          <w:color w:val="1E3A5F"/>
-          <w:sz w:val="19"/>
+          <w:color w:val="193654"/>
+          <w:sz w:val="20"/>
         </w:rPr>
         <w:t>EDUCATION</w:t>
       </w:r>
     </w:p>
     <w:p>
       <w:pPr>
+        <w:keepLines/>
+        <w:tabs>
+          <w:tab w:pos="9936" w:val="right"/>
+        </w:tabs>
         <w:spacing w:before="0" w:after="0" w:line="240" w:lineRule="auto"/>
         <w:jc w:val="both"/>
       </w:pPr>
       <w:r>
         <w:rPr>
-          <w:rFonts w:ascii="Calibri" w:hAnsi="Calibri"/>
+          <w:rFonts w:ascii="Aptos" w:hAnsi="Aptos"/>
           <w:b/>
           <w:i w:val="0"/>
-          <w:color w:val="262A2E"/>
+          <w:color w:val="20252B"/>
           <w:sz w:val="18"/>
         </w:rPr>
         <w:t>Doctor of Philosophy, Cognitive Neuroscience</w:t>
       </w:r>
       <w:r>
         <w:rPr>
-          <w:rFonts w:ascii="Calibri" w:hAnsi="Calibri"/>
-          <w:b w:val="0"/>
+          <w:rFonts w:ascii="Aptos" w:hAnsi="Aptos"/>
+          <w:b/>
           <w:i w:val="0"/>
-          <w:color w:val="3A5E8C"/>
-          <w:sz w:val="16"/>
+          <w:color w:val="1E6A73"/>
+          <w:sz w:val="17"/>
         </w:rPr>
-        <w:t xml:space="preserve">   03/2025 – Present</w:t>
+        <w:tab/>
+        <w:t>03/2025 – Present</w:t>
       </w:r>
     </w:p>
     <w:p>
       <w:pPr>
-        <w:spacing w:before="0" w:after="0" w:line="240" w:lineRule="auto"/>
+        <w:keepLines/>
+        <w:spacing w:before="0" w:after="60" w:line="259" w:lineRule="auto"/>
         <w:jc w:val="both"/>
       </w:pPr>
       <w:r>
         <w:rPr>
-          <w:rFonts w:ascii="Calibri" w:hAnsi="Calibri"/>
+          <w:rFonts w:ascii="Aptos" w:hAnsi="Aptos"/>
           <w:b w:val="0"/>
-          <w:i w:val="0"/>
-          <w:color w:val="262A2E"/>
+          <w:i/>
+          <w:color w:val="5C646D"/>
           <w:sz w:val="17"/>
         </w:rPr>
         <w:t>Institute of Psychology, Chinese Academy of Sciences</w:t>
       </w:r>
       <w:r>
         <w:rPr>
-          <w:rFonts w:ascii="Calibri" w:hAnsi="Calibri"/>
+          <w:rFonts w:ascii="Aptos" w:hAnsi="Aptos"/>
           <w:b w:val="0"/>
           <w:i w:val="0"/>
-          <w:color w:val="5F666E"/>
+          <w:color w:val="5C646D"/>
           <w:sz w:val="17"/>
         </w:rPr>
-        <w:t xml:space="preserve"> · Beijing</w:t>
+        <w:t xml:space="preserve">, Beijing. </w:t>
+      </w:r>
+      <w:r>
+        <w:rPr>
+          <w:rFonts w:ascii="Aptos" w:hAnsi="Aptos"/>
+          <w:b w:val="0"/>
+          <w:i w:val="0"/>
+          <w:color w:val="20252B"/>
+          <w:sz w:val="17"/>
+        </w:rPr>
+        <w:t>Using twin data to investigate the brain mechanisms through which genetic and environmental factors influence mental health.</w:t>
+      </w:r>
+      <w:r>
+        <w:rPr>
+          <w:rFonts w:ascii="Aptos" w:hAnsi="Aptos"/>
+          <w:b w:val="0"/>
+          <w:i w:val="0"/>
+          <w:color w:val="5C646D"/>
+          <w:sz w:val="17"/>
+        </w:rPr>
+        <w:t xml:space="preserve"> Supervisor: Prof. Yuan Zhou.</w:t>
       </w:r>
     </w:p>
     <w:p>
       <w:pPr>
+        <w:keepLines/>
+        <w:tabs>
+          <w:tab w:pos="9936" w:val="right"/>
+        </w:tabs>
         <w:spacing w:before="0" w:after="0" w:line="240" w:lineRule="auto"/>
         <w:jc w:val="both"/>
       </w:pPr>
       <w:r>
         <w:rPr>
-          <w:rFonts w:ascii="Calibri" w:hAnsi="Calibri"/>
-          <w:b w:val="0"/>
-          <w:i w:val="0"/>
-          <w:color w:val="5F666E"/>
-          <w:sz w:val="16"/>
-        </w:rPr>
-        <w:t>Using twin data to investigate the brain mechanisms through which genetic and environmental factors influence mental health.</w:t>
-      </w:r>
-    </w:p>
-    <w:p>
-      <w:pPr>
-        <w:spacing w:before="0" w:after="60" w:line="240" w:lineRule="auto"/>
-        <w:jc w:val="both"/>
-      </w:pPr>
-      <w:r>
-        <w:rPr>
-          <w:rFonts w:ascii="Calibri" w:hAnsi="Calibri"/>
-          <w:b w:val="0"/>
-          <w:i w:val="0"/>
-          <w:color w:val="5F666E"/>
-          <w:sz w:val="16"/>
-        </w:rPr>
-        <w:t>Supervisor: Prof. Yuan Zhou</w:t>
-      </w:r>
-    </w:p>
-    <w:p>
-      <w:pPr>
-        <w:spacing w:before="0" w:after="0" w:line="240" w:lineRule="auto"/>
-        <w:jc w:val="both"/>
-      </w:pPr>
-      <w:r>
-        <w:rPr>
-          <w:rFonts w:ascii="Calibri" w:hAnsi="Calibri"/>
+          <w:rFonts w:ascii="Aptos" w:hAnsi="Aptos"/>
           <w:b/>
           <w:i w:val="0"/>
-          <w:color w:val="262A2E"/>
+          <w:color w:val="20252B"/>
           <w:sz w:val="18"/>
         </w:rPr>
         <w:t>Master of Philosophy, Applied Psychology</w:t>
       </w:r>
       <w:r>
         <w:rPr>
-          <w:rFonts w:ascii="Calibri" w:hAnsi="Calibri"/>
-          <w:b w:val="0"/>
+          <w:rFonts w:ascii="Aptos" w:hAnsi="Aptos"/>
+          <w:b/>
           <w:i w:val="0"/>
-          <w:color w:val="3A5E8C"/>
-          <w:sz w:val="16"/>
+          <w:color w:val="1E6A73"/>
+          <w:sz w:val="17"/>
         </w:rPr>
-        <w:t xml:space="preserve">   09/2022 – 03/2025</w:t>
+        <w:tab/>
+        <w:t>09/2022 – 03/2025</w:t>
       </w:r>
     </w:p>
     <w:p>
       <w:pPr>
-        <w:spacing w:before="0" w:after="0" w:line="240" w:lineRule="auto"/>
+        <w:keepLines/>
+        <w:spacing w:before="0" w:after="60" w:line="259" w:lineRule="auto"/>
         <w:jc w:val="both"/>
       </w:pPr>
       <w:r>
         <w:rPr>
-          <w:rFonts w:ascii="Calibri" w:hAnsi="Calibri"/>
+          <w:rFonts w:ascii="Aptos" w:hAnsi="Aptos"/>
           <w:b w:val="0"/>
-          <w:i w:val="0"/>
-          <w:color w:val="262A2E"/>
+          <w:i/>
+          <w:color w:val="5C646D"/>
           <w:sz w:val="17"/>
         </w:rPr>
         <w:t>Institute of Psychology, Chinese Academy of Sciences</w:t>
       </w:r>
       <w:r>
         <w:rPr>
-          <w:rFonts w:ascii="Calibri" w:hAnsi="Calibri"/>
+          <w:rFonts w:ascii="Aptos" w:hAnsi="Aptos"/>
           <w:b w:val="0"/>
           <w:i w:val="0"/>
-          <w:color w:val="5F666E"/>
+          <w:color w:val="5C646D"/>
           <w:sz w:val="17"/>
         </w:rPr>
-        <w:t xml:space="preserve"> · Beijing</w:t>
+        <w:t xml:space="preserve">, Beijing. </w:t>
+      </w:r>
+      <w:r>
+        <w:rPr>
+          <w:rFonts w:ascii="Aptos" w:hAnsi="Aptos"/>
+          <w:b w:val="0"/>
+          <w:i w:val="0"/>
+          <w:color w:val="20252B"/>
+          <w:sz w:val="17"/>
+        </w:rPr>
+        <w:t>Using computational modelling and experimental psychology to study behavioural decision-making.</w:t>
+      </w:r>
+      <w:r>
+        <w:rPr>
+          <w:rFonts w:ascii="Aptos" w:hAnsi="Aptos"/>
+          <w:b w:val="0"/>
+          <w:i w:val="0"/>
+          <w:color w:val="5C646D"/>
+          <w:sz w:val="17"/>
+        </w:rPr>
+        <w:t xml:space="preserve"> Supervisor: Prof. Yuan Zhou.</w:t>
       </w:r>
     </w:p>
     <w:p>
       <w:pPr>
+        <w:keepLines/>
+        <w:tabs>
+          <w:tab w:pos="9936" w:val="right"/>
+        </w:tabs>
         <w:spacing w:before="0" w:after="0" w:line="240" w:lineRule="auto"/>
         <w:jc w:val="both"/>
       </w:pPr>
       <w:r>
         <w:rPr>
-          <w:rFonts w:ascii="Calibri" w:hAnsi="Calibri"/>
-          <w:b w:val="0"/>
-          <w:i w:val="0"/>
-          <w:color w:val="5F666E"/>
-          <w:sz w:val="16"/>
-        </w:rPr>
-        <w:t>Using computational modelling and experimental psychology to study behavioural decision-making.</w:t>
-      </w:r>
-    </w:p>
-    <w:p>
-      <w:pPr>
-        <w:spacing w:before="0" w:after="60" w:line="240" w:lineRule="auto"/>
-        <w:jc w:val="both"/>
-      </w:pPr>
-      <w:r>
-        <w:rPr>
-          <w:rFonts w:ascii="Calibri" w:hAnsi="Calibri"/>
-          <w:b w:val="0"/>
-          <w:i w:val="0"/>
-          <w:color w:val="5F666E"/>
-          <w:sz w:val="16"/>
-        </w:rPr>
-        <w:t>Supervisor: Prof. Yuan Zhou</w:t>
-      </w:r>
-    </w:p>
-    <w:p>
-      <w:pPr>
-        <w:spacing w:before="0" w:after="0" w:line="240" w:lineRule="auto"/>
-        <w:jc w:val="both"/>
-      </w:pPr>
-      <w:r>
-        <w:rPr>
-          <w:rFonts w:ascii="Calibri" w:hAnsi="Calibri"/>
+          <w:rFonts w:ascii="Aptos" w:hAnsi="Aptos"/>
           <w:b/>
           <w:i w:val="0"/>
-          <w:color w:val="262A2E"/>
+          <w:color w:val="20252B"/>
           <w:sz w:val="18"/>
         </w:rPr>
         <w:t>Bachelor of Philosophy, Applied Psychology</w:t>
       </w:r>
       <w:r>
         <w:rPr>
-          <w:rFonts w:ascii="Calibri" w:hAnsi="Calibri"/>
-          <w:b w:val="0"/>
+          <w:rFonts w:ascii="Aptos" w:hAnsi="Aptos"/>
+          <w:b/>
           <w:i w:val="0"/>
-          <w:color w:val="3A5E8C"/>
-          <w:sz w:val="16"/>
+          <w:color w:val="1E6A73"/>
+          <w:sz w:val="17"/>
         </w:rPr>
-        <w:t xml:space="preserve">   09/2018 – 06/2022</w:t>
+        <w:tab/>
+        <w:t>09/2018 – 06/2022</w:t>
       </w:r>
     </w:p>
     <w:p>
       <w:pPr>
-        <w:spacing w:before="0" w:after="0" w:line="240" w:lineRule="auto"/>
+        <w:keepLines/>
+        <w:spacing w:before="0" w:after="60" w:line="259" w:lineRule="auto"/>
         <w:jc w:val="both"/>
       </w:pPr>
       <w:r>
         <w:rPr>
-          <w:rFonts w:ascii="Calibri" w:hAnsi="Calibri"/>
+          <w:rFonts w:ascii="Aptos" w:hAnsi="Aptos"/>
           <w:b w:val="0"/>
-          <w:i w:val="0"/>
-          <w:color w:val="262A2E"/>
+          <w:i/>
+          <w:color w:val="5C646D"/>
           <w:sz w:val="17"/>
         </w:rPr>
         <w:t>Faculty of Psychology, Southwest University</w:t>
       </w:r>
       <w:r>
         <w:rPr>
-          <w:rFonts w:ascii="Calibri" w:hAnsi="Calibri"/>
+          <w:rFonts w:ascii="Aptos" w:hAnsi="Aptos"/>
           <w:b w:val="0"/>
           <w:i w:val="0"/>
-          <w:color w:val="5F666E"/>
+          <w:color w:val="5C646D"/>
           <w:sz w:val="17"/>
         </w:rPr>
-        <w:t xml:space="preserve"> · Chongqing</w:t>
+        <w:t xml:space="preserve">, Chongqing. </w:t>
+      </w:r>
+      <w:r>
+        <w:rPr>
+          <w:rFonts w:ascii="Aptos" w:hAnsi="Aptos"/>
+          <w:b w:val="0"/>
+          <w:i w:val="0"/>
+          <w:color w:val="20252B"/>
+          <w:sz w:val="17"/>
+        </w:rPr>
+        <w:t>Trained in research on procrastination.</w:t>
+      </w:r>
+      <w:r>
+        <w:rPr>
+          <w:rFonts w:ascii="Aptos" w:hAnsi="Aptos"/>
+          <w:b w:val="0"/>
+          <w:i w:val="0"/>
+          <w:color w:val="5C646D"/>
+          <w:sz w:val="17"/>
+        </w:rPr>
+        <w:t xml:space="preserve"> Supervisor: Prof. Tingyong Feng.</w:t>
       </w:r>
     </w:p>
     <w:p>
       <w:pPr>
-        <w:spacing w:before="0" w:after="0" w:line="240" w:lineRule="auto"/>
+        <w:pStyle w:val="CVSection"/>
+        <w:spacing w:before="80"/>
+        <w:jc w:val="left"/>
+      </w:pPr>
+      <w:r>
+        <w:rPr>
+          <w:rFonts w:ascii="Aptos Display" w:hAnsi="Aptos Display"/>
+          <w:b/>
+          <w:i w:val="0"/>
+          <w:color w:val="193654"/>
+          <w:sz w:val="20"/>
+        </w:rPr>
+        <w:t>RESEARCH FOCUS AND METHODS</w:t>
+      </w:r>
+    </w:p>
+    <w:p>
+      <w:pPr>
+        <w:keepLines w:val="0"/>
+        <w:spacing w:before="0" w:after="40" w:line="259" w:lineRule="auto"/>
         <w:jc w:val="both"/>
       </w:pPr>
       <w:r>
         <w:rPr>
-          <w:rFonts w:ascii="Calibri" w:hAnsi="Calibri"/>
+          <w:rFonts w:ascii="Aptos" w:hAnsi="Aptos"/>
+          <w:b/>
+          <w:i w:val="0"/>
+          <w:color w:val="193654"/>
+          <w:sz w:val="18"/>
+        </w:rPr>
+        <w:t xml:space="preserve">Focus: </w:t>
+      </w:r>
+      <w:r>
+        <w:rPr>
+          <w:rFonts w:ascii="Aptos" w:hAnsi="Aptos"/>
           <w:b w:val="0"/>
           <w:i w:val="0"/>
-          <w:color w:val="5F666E"/>
-          <w:sz w:val="16"/>
+          <w:color w:val="20252B"/>
+          <w:sz w:val="18"/>
         </w:rPr>
-        <w:t>Trained in research on procrastination.</w:t>
+        <w:t>Affective psychopathology: anxiety and depression; Behavioral genetics and twin neuroimaging; Individual differences in self-regulation.</w:t>
       </w:r>
     </w:p>
     <w:p>
       <w:pPr>
-        <w:spacing w:before="0" w:after="60" w:line="240" w:lineRule="auto"/>
+        <w:keepLines w:val="0"/>
+        <w:spacing w:before="0" w:after="60" w:line="259" w:lineRule="auto"/>
         <w:jc w:val="both"/>
       </w:pPr>
       <w:r>
         <w:rPr>
-          <w:rFonts w:ascii="Calibri" w:hAnsi="Calibri"/>
+          <w:rFonts w:ascii="Aptos" w:hAnsi="Aptos"/>
+          <w:b/>
+          <w:i w:val="0"/>
+          <w:color w:val="193654"/>
+          <w:sz w:val="18"/>
+        </w:rPr>
+        <w:t xml:space="preserve">Methods: </w:t>
+      </w:r>
+      <w:r>
+        <w:rPr>
+          <w:rFonts w:ascii="Aptos" w:hAnsi="Aptos"/>
           <w:b w:val="0"/>
           <w:i w:val="0"/>
-          <w:color w:val="5F666E"/>
-          <w:sz w:val="16"/>
+          <w:color w:val="20252B"/>
+          <w:sz w:val="18"/>
         </w:rPr>
-        <w:t>Supervisor: Prof. Tingyong Feng</w:t>
+        <w:t>Twin-based ACE and multivariate genetic modeling. Structural MRI, resting-state fMRI, connectome, and network analysis. Normative modeling, representational similarity analysis, spatial-null inference, and reproducible workflows in Python, MATLAB, and R.</w:t>
       </w:r>
     </w:p>
     <w:p>
       <w:pPr>
-        <w:spacing w:before="100" w:after="40" w:line="240" w:lineRule="auto"/>
-        <w:jc w:val="both"/>
-        <w:pBdr>
-          <w:bottom w:val="single" w:sz="6" w:space="1" w:color="C9D3E0"/>
-        </w:pBdr>
+        <w:pStyle w:val="CVSection"/>
+        <w:spacing w:before="80"/>
+        <w:jc w:val="left"/>
       </w:pPr>
       <w:r>
         <w:rPr>
-          <w:rFonts w:ascii="Cambria" w:hAnsi="Cambria"/>
+          <w:rFonts w:ascii="Aptos Display" w:hAnsi="Aptos Display"/>
           <w:b/>
           <w:i w:val="0"/>
-          <w:color w:val="1E3A5F"/>
-          <w:sz w:val="19"/>
+          <w:color w:val="193654"/>
+          <w:sz w:val="20"/>
         </w:rPr>
-        <w:t>RESEARCH INTERESTS</w:t>
+        <w:t>SELECTED AWARDS AND HONOURS</w:t>
       </w:r>
     </w:p>
     <w:p>
       <w:pPr>
-        <w:spacing w:before="0" w:after="40" w:line="240" w:lineRule="auto"/>
+        <w:keepLines/>
+        <w:spacing w:before="0" w:after="20" w:line="245" w:lineRule="auto"/>
+        <w:ind w:left="619" w:hanging="619"/>
         <w:jc w:val="both"/>
       </w:pPr>
       <w:r>
         <w:rPr>
-          <w:rFonts w:ascii="Calibri" w:hAnsi="Calibri"/>
-          <w:b w:val="0"/>
-          <w:i w:val="0"/>
-          <w:color w:val="262A2E"/>
-          <w:sz w:val="18"/>
-        </w:rPr>
-        <w:t>Neuroimaging of psychiatric disorders  ·  Behavioral genetics and twin studies  ·  Behavioral decision-making</w:t>
-      </w:r>
-    </w:p>
-    <w:p>
-      <w:pPr>
-        <w:spacing w:before="100" w:after="40" w:line="240" w:lineRule="auto"/>
-        <w:jc w:val="both"/>
-        <w:pBdr>
-          <w:bottom w:val="single" w:sz="6" w:space="1" w:color="C9D3E0"/>
-        </w:pBdr>
-      </w:pPr>
-      <w:r>
-        <w:rPr>
-          <w:rFonts w:ascii="Cambria" w:hAnsi="Cambria"/>
+          <w:rFonts w:ascii="Aptos" w:hAnsi="Aptos"/>
           <w:b/>
           <w:i w:val="0"/>
-          <w:color w:val="1E3A5F"/>
-          <w:sz w:val="19"/>
-        </w:rPr>
-        <w:t>SKILLS</w:t>
-      </w:r>
-    </w:p>
-    <w:p>
-      <w:pPr>
-        <w:spacing w:before="0" w:after="40" w:line="252" w:lineRule="auto"/>
-        <w:jc w:val="both"/>
-      </w:pPr>
-      <w:r>
-        <w:rPr>
-          <w:rFonts w:ascii="Calibri" w:hAnsi="Calibri"/>
-          <w:b w:val="0"/>
-          <w:i w:val="0"/>
-          <w:color w:val="262A2E"/>
-          <w:sz w:val="17"/>
-        </w:rPr>
-        <w:t>Proficient in twin-based genetic modeling and heritability analysis  ·  Experienced in neuroimaging and network analysis methods  ·  Well trained in the theoretical frameworks and methodological approaches of clinical research on anxiety and depression.</w:t>
-      </w:r>
-    </w:p>
-    <w:p>
-      <w:pPr>
-        <w:spacing w:before="100" w:after="40" w:line="240" w:lineRule="auto"/>
-        <w:jc w:val="both"/>
-        <w:pBdr>
-          <w:bottom w:val="single" w:sz="6" w:space="1" w:color="C9D3E0"/>
-        </w:pBdr>
-      </w:pPr>
-      <w:r>
-        <w:rPr>
-          <w:rFonts w:ascii="Cambria" w:hAnsi="Cambria"/>
-          <w:b/>
-          <w:i w:val="0"/>
-          <w:color w:val="1E3A5F"/>
-          <w:sz w:val="19"/>
-        </w:rPr>
-        <w:t>LANGUAGES</w:t>
-      </w:r>
-    </w:p>
-    <w:p>
-      <w:pPr>
-        <w:spacing w:before="0" w:after="40" w:line="240" w:lineRule="auto"/>
-        <w:jc w:val="both"/>
-      </w:pPr>
-      <w:r>
-        <w:rPr>
-          <w:rFonts w:ascii="Calibri" w:hAnsi="Calibri"/>
-          <w:b/>
-          <w:i w:val="0"/>
-          <w:color w:val="262A2E"/>
-          <w:sz w:val="18"/>
-        </w:rPr>
-        <w:t xml:space="preserve">English: </w:t>
-      </w:r>
-      <w:r>
-        <w:rPr>
-          <w:rFonts w:ascii="Calibri" w:hAnsi="Calibri"/>
-          <w:b w:val="0"/>
-          <w:i w:val="0"/>
-          <w:color w:val="5F666E"/>
-          <w:sz w:val="18"/>
-        </w:rPr>
-        <w:t>Advanced (IELTS 7.0)</w:t>
-      </w:r>
-    </w:p>
-    <w:p>
-      <w:pPr>
-        <w:spacing w:before="100" w:after="40" w:line="240" w:lineRule="auto"/>
-        <w:jc w:val="both"/>
-        <w:pBdr>
-          <w:bottom w:val="single" w:sz="6" w:space="1" w:color="C9D3E0"/>
-        </w:pBdr>
-      </w:pPr>
-      <w:r>
-        <w:rPr>
-          <w:rFonts w:ascii="Cambria" w:hAnsi="Cambria"/>
-          <w:b/>
-          <w:i w:val="0"/>
-          <w:color w:val="1E3A5F"/>
-          <w:sz w:val="19"/>
-        </w:rPr>
-        <w:t>AWARDS &amp; HONOURS</w:t>
-      </w:r>
-    </w:p>
-    <w:p>
-      <w:pPr>
-        <w:spacing w:before="0" w:after="20" w:line="245" w:lineRule="auto"/>
-        <w:ind w:left="605" w:hanging="605"/>
-        <w:jc w:val="both"/>
-      </w:pPr>
-      <w:r>
-        <w:rPr>
-          <w:rFonts w:ascii="Calibri" w:hAnsi="Calibri"/>
-          <w:b/>
-          <w:i w:val="0"/>
-          <w:color w:val="3A5E8C"/>
+          <w:color w:val="1E6A73"/>
           <w:sz w:val="17"/>
         </w:rPr>
         <w:t xml:space="preserve">2026  </w:t>
       </w:r>
       <w:r>
         <w:rPr>
-          <w:rFonts w:ascii="Calibri" w:hAnsi="Calibri"/>
+          <w:rFonts w:ascii="Aptos" w:hAnsi="Aptos"/>
           <w:b w:val="0"/>
           <w:i w:val="0"/>
-          <w:color w:val="262A2E"/>
+          <w:color w:val="20252B"/>
           <w:sz w:val="17"/>
         </w:rPr>
         <w:t>Director's Scholarship, Institute of Psychology, Chinese Academy of Sciences (Top 5 institute-wide)</w:t>
@@ -500,26 +572,27 @@
     </w:p>
     <w:p>
       <w:pPr>
+        <w:keepLines/>
         <w:spacing w:before="0" w:after="20" w:line="245" w:lineRule="auto"/>
-        <w:ind w:left="605" w:hanging="605"/>
+        <w:ind w:left="619" w:hanging="619"/>
         <w:jc w:val="both"/>
       </w:pPr>
       <w:r>
         <w:rPr>
-          <w:rFonts w:ascii="Calibri" w:hAnsi="Calibri"/>
+          <w:rFonts w:ascii="Aptos" w:hAnsi="Aptos"/>
           <w:b/>
           <w:i w:val="0"/>
-          <w:color w:val="3A5E8C"/>
+          <w:color w:val="1E6A73"/>
           <w:sz w:val="17"/>
         </w:rPr>
         <w:t xml:space="preserve">2026  </w:t>
       </w:r>
       <w:r>
         <w:rPr>
-          <w:rFonts w:ascii="Calibri" w:hAnsi="Calibri"/>
+          <w:rFonts w:ascii="Aptos" w:hAnsi="Aptos"/>
           <w:b w:val="0"/>
           <w:i w:val="0"/>
-          <w:color w:val="262A2E"/>
+          <w:color w:val="20252B"/>
           <w:sz w:val="17"/>
         </w:rPr>
         <w:t>Best Presentation Award (3/500) and Best Academic Communication Award (3/988), First Capital Universities Undergraduate Academic Conference</w:t>
@@ -527,26 +600,27 @@
     </w:p>
     <w:p>
       <w:pPr>
+        <w:keepLines/>
         <w:spacing w:before="0" w:after="20" w:line="245" w:lineRule="auto"/>
-        <w:ind w:left="605" w:hanging="605"/>
+        <w:ind w:left="619" w:hanging="619"/>
         <w:jc w:val="both"/>
       </w:pPr>
       <w:r>
         <w:rPr>
-          <w:rFonts w:ascii="Calibri" w:hAnsi="Calibri"/>
+          <w:rFonts w:ascii="Aptos" w:hAnsi="Aptos"/>
           <w:b/>
           <w:i w:val="0"/>
-          <w:color w:val="3A5E8C"/>
+          <w:color w:val="1E6A73"/>
           <w:sz w:val="17"/>
         </w:rPr>
         <w:t xml:space="preserve">2025  </w:t>
       </w:r>
       <w:r>
         <w:rPr>
-          <w:rFonts w:ascii="Calibri" w:hAnsi="Calibri"/>
+          <w:rFonts w:ascii="Aptos" w:hAnsi="Aptos"/>
           <w:b w:val="0"/>
           <w:i w:val="0"/>
-          <w:color w:val="262A2E"/>
+          <w:color w:val="20252B"/>
           <w:sz w:val="17"/>
         </w:rPr>
         <w:t>Outstanding Student (Top 15%) and Outstanding Student Model (Top 1%), University of Chinese Academy of Sciences</w:t>
@@ -554,26 +628,27 @@
     </w:p>
     <w:p>
       <w:pPr>
+        <w:keepLines/>
         <w:spacing w:before="0" w:after="20" w:line="245" w:lineRule="auto"/>
-        <w:ind w:left="605" w:hanging="605"/>
+        <w:ind w:left="619" w:hanging="619"/>
         <w:jc w:val="both"/>
       </w:pPr>
       <w:r>
         <w:rPr>
-          <w:rFonts w:ascii="Calibri" w:hAnsi="Calibri"/>
+          <w:rFonts w:ascii="Aptos" w:hAnsi="Aptos"/>
           <w:b/>
           <w:i w:val="0"/>
-          <w:color w:val="3A5E8C"/>
+          <w:color w:val="1E6A73"/>
           <w:sz w:val="17"/>
         </w:rPr>
         <w:t xml:space="preserve">2022–2025  </w:t>
       </w:r>
       <w:r>
         <w:rPr>
-          <w:rFonts w:ascii="Calibri" w:hAnsi="Calibri"/>
+          <w:rFonts w:ascii="Aptos" w:hAnsi="Aptos"/>
           <w:b w:val="0"/>
           <w:i w:val="0"/>
-          <w:color w:val="262A2E"/>
+          <w:color w:val="20252B"/>
           <w:sz w:val="17"/>
         </w:rPr>
         <w:t>Academic Excellence Scholarship, University of Chinese Academy of Sciences</w:t>
@@ -581,26 +656,27 @@
     </w:p>
     <w:p>
       <w:pPr>
+        <w:keepLines/>
         <w:spacing w:before="0" w:after="20" w:line="245" w:lineRule="auto"/>
-        <w:ind w:left="605" w:hanging="605"/>
+        <w:ind w:left="619" w:hanging="619"/>
         <w:jc w:val="both"/>
       </w:pPr>
       <w:r>
         <w:rPr>
-          <w:rFonts w:ascii="Calibri" w:hAnsi="Calibri"/>
+          <w:rFonts w:ascii="Aptos" w:hAnsi="Aptos"/>
           <w:b/>
           <w:i w:val="0"/>
-          <w:color w:val="3A5E8C"/>
+          <w:color w:val="1E6A73"/>
           <w:sz w:val="17"/>
         </w:rPr>
         <w:t xml:space="preserve">2022  </w:t>
       </w:r>
       <w:r>
         <w:rPr>
-          <w:rFonts w:ascii="Calibri" w:hAnsi="Calibri"/>
+          <w:rFonts w:ascii="Aptos" w:hAnsi="Aptos"/>
           <w:b w:val="0"/>
           <w:i w:val="0"/>
-          <w:color w:val="262A2E"/>
+          <w:color w:val="20252B"/>
           <w:sz w:val="17"/>
         </w:rPr>
         <w:t>Undergraduate Scholarship, University of Chinese Academy of Sciences</w:t>
@@ -608,961 +684,702 @@
     </w:p>
     <w:p>
       <w:pPr>
-        <w:spacing w:before="100" w:after="40" w:line="240" w:lineRule="auto"/>
+        <w:keepLines w:val="0"/>
+        <w:spacing w:before="0" w:after="40" w:line="240" w:lineRule="auto"/>
         <w:jc w:val="both"/>
-        <w:pBdr>
-          <w:bottom w:val="single" w:sz="6" w:space="1" w:color="C9D3E0"/>
-        </w:pBdr>
       </w:pPr>
       <w:r>
         <w:rPr>
-          <w:rFonts w:ascii="Cambria" w:hAnsi="Cambria"/>
+          <w:rFonts w:ascii="Aptos" w:hAnsi="Aptos"/>
           <w:b/>
           <w:i w:val="0"/>
-          <w:color w:val="1E3A5F"/>
-          <w:sz w:val="19"/>
+          <w:color w:val="193654"/>
+          <w:sz w:val="17"/>
         </w:rPr>
-        <w:t>PUBLICATIONS</w:t>
+        <w:t xml:space="preserve">Languages: </w:t>
+      </w:r>
+      <w:r>
+        <w:rPr>
+          <w:rFonts w:ascii="Aptos" w:hAnsi="Aptos"/>
+          <w:b w:val="0"/>
+          <w:i w:val="0"/>
+          <w:color w:val="20252B"/>
+          <w:sz w:val="17"/>
+        </w:rPr>
+        <w:t>English - Advanced (IELTS 7.0).</w:t>
       </w:r>
     </w:p>
     <w:p>
       <w:pPr>
-        <w:spacing w:before="20" w:after="20" w:line="240" w:lineRule="auto"/>
+        <w:pStyle w:val="CVSection"/>
+        <w:spacing w:before="80"/>
+        <w:jc w:val="left"/>
+      </w:pPr>
+      <w:r>
+        <w:rPr>
+          <w:rFonts w:ascii="Aptos Display" w:hAnsi="Aptos Display"/>
+          <w:b/>
+          <w:i w:val="0"/>
+          <w:color w:val="193654"/>
+          <w:sz w:val="20"/>
+        </w:rPr>
+        <w:t>SELECTED PUBLICATIONS</w:t>
+      </w:r>
+    </w:p>
+    <w:p>
+      <w:pPr>
+        <w:keepLines/>
+        <w:spacing w:before="0" w:after="64" w:line="264" w:lineRule="auto"/>
+        <w:ind w:left="317" w:hanging="317"/>
         <w:jc w:val="both"/>
       </w:pPr>
       <w:r>
         <w:rPr>
-          <w:rFonts w:ascii="Calibri" w:hAnsi="Calibri"/>
+          <w:rFonts w:ascii="Aptos" w:hAnsi="Aptos"/>
           <w:b/>
           <w:i w:val="0"/>
-          <w:color w:val="5F666E"/>
-          <w:sz w:val="16"/>
-        </w:rPr>
-        <w:t>Lead-author publications</w:t>
-      </w:r>
-    </w:p>
-    <w:p>
-      <w:pPr>
-        <w:spacing w:before="0" w:after="40" w:line="254" w:lineRule="auto"/>
-        <w:ind w:left="288" w:hanging="288"/>
-        <w:jc w:val="both"/>
-      </w:pPr>
-      <w:r>
-        <w:rPr>
-          <w:rFonts w:ascii="Calibri" w:hAnsi="Calibri"/>
-          <w:b/>
-          <w:i w:val="0"/>
-          <w:color w:val="3A5E8C"/>
-          <w:sz w:val="16"/>
+          <w:color w:val="1E6A73"/>
+          <w:sz w:val="17"/>
         </w:rPr>
         <w:t xml:space="preserve">1. </w:t>
       </w:r>
       <w:r>
         <w:rPr>
-          <w:rFonts w:ascii="Calibri" w:hAnsi="Calibri"/>
+          <w:rFonts w:ascii="Aptos" w:hAnsi="Aptos"/>
           <w:b/>
           <w:i w:val="0"/>
-          <w:color w:val="1E3A5F"/>
-          <w:sz w:val="16"/>
+          <w:color w:val="193654"/>
+          <w:sz w:val="17"/>
         </w:rPr>
         <w:t>Yuanyuan Hu</w:t>
       </w:r>
       <w:r>
         <w:rPr>
-          <w:rFonts w:ascii="Calibri" w:hAnsi="Calibri"/>
+          <w:rFonts w:ascii="Aptos" w:hAnsi="Aptos"/>
           <w:b w:val="0"/>
           <w:i w:val="0"/>
-          <w:color w:val="262A2E"/>
-          <w:sz w:val="16"/>
+          <w:color w:val="20252B"/>
+          <w:sz w:val="17"/>
         </w:rPr>
-        <w:t>, Jie Xiang, Yuening Jin, Qingchen Fan, Changshuo Wang, Yihan Wu, Dang Zheng, Yancheng Tang, Wei Li, Bowen Hu, Tingyong Feng, Yuan Zhou &amp; Zhiyi Chen</w:t>
+        <w:t>, Jie Xiang, Yuening Jin, et al.</w:t>
       </w:r>
       <w:r>
         <w:rPr>
-          <w:rFonts w:ascii="Calibri" w:hAnsi="Calibri"/>
+          <w:rFonts w:ascii="Aptos" w:hAnsi="Aptos"/>
           <w:b w:val="0"/>
           <w:i w:val="0"/>
-          <w:color w:val="262A2E"/>
-          <w:sz w:val="16"/>
+          <w:color w:val="20252B"/>
+          <w:sz w:val="17"/>
         </w:rPr>
         <w:t xml:space="preserve"> (2026). </w:t>
       </w:r>
+      <w:hyperlink r:id="rId14">
+        <w:r>
+          <w:rPr>
+            <w:rFonts w:ascii="Aptos" w:hAnsi="Aptos"/>
+            <w:color w:val="1E6A73"/>
+            <w:sz w:val="17"/>
+            <w:szCs w:val="17"/>
+            <w:u w:val="single"/>
+          </w:rPr>
+          <w:t>Shared neurogenetic substrates of nonplanning impulsivity and procrastination</w:t>
+        </w:r>
+      </w:hyperlink>
       <w:r>
         <w:rPr>
-          <w:rFonts w:ascii="Calibri" w:hAnsi="Calibri"/>
+          <w:rFonts w:ascii="Aptos" w:hAnsi="Aptos"/>
           <w:b w:val="0"/>
           <w:i w:val="0"/>
-          <w:color w:val="262A2E"/>
-          <w:sz w:val="16"/>
+          <w:color w:val="20252B"/>
+          <w:sz w:val="17"/>
         </w:rPr>
-        <w:t xml:space="preserve">Shared neurogenetic substrates of nonplanning impulsivity and procrastination. </w:t>
+        <w:t xml:space="preserve">. </w:t>
       </w:r>
       <w:r>
         <w:rPr>
-          <w:rFonts w:ascii="Calibri" w:hAnsi="Calibri"/>
+          <w:rFonts w:ascii="Aptos" w:hAnsi="Aptos"/>
           <w:b w:val="0"/>
           <w:i/>
-          <w:color w:val="262A2E"/>
-          <w:sz w:val="16"/>
+          <w:color w:val="20252B"/>
+          <w:sz w:val="17"/>
         </w:rPr>
         <w:t>Proceedings of the National Academy of Sciences</w:t>
       </w:r>
       <w:r>
         <w:rPr>
-          <w:rFonts w:ascii="Calibri" w:hAnsi="Calibri"/>
+          <w:rFonts w:ascii="Aptos" w:hAnsi="Aptos"/>
           <w:b w:val="0"/>
           <w:i w:val="0"/>
-          <w:color w:val="262A2E"/>
-          <w:sz w:val="16"/>
+          <w:color w:val="20252B"/>
+          <w:sz w:val="17"/>
         </w:rPr>
         <w:t>, 123(28), e2605127123</w:t>
       </w:r>
       <w:r>
         <w:rPr>
-          <w:rFonts w:ascii="Calibri" w:hAnsi="Calibri"/>
+          <w:rFonts w:ascii="Aptos" w:hAnsi="Aptos"/>
           <w:b w:val="0"/>
           <w:i w:val="0"/>
-          <w:color w:val="262A2E"/>
+          <w:color w:val="20252B"/>
+          <w:sz w:val="17"/>
+        </w:rPr>
+        <w:t>.</w:t>
+      </w:r>
+      <w:r>
+        <w:rPr>
+          <w:rFonts w:ascii="Aptos" w:hAnsi="Aptos"/>
+          <w:b w:val="0"/>
+          <w:i w:val="0"/>
+          <w:color w:val="5C646D"/>
           <w:sz w:val="16"/>
+        </w:rPr>
+        <w:t xml:space="preserve">  Independent first author | SCI · Q1 · 5-year IF 10.6</w:t>
+      </w:r>
+    </w:p>
+    <w:p>
+      <w:pPr>
+        <w:keepLines/>
+        <w:spacing w:before="0" w:after="64" w:line="264" w:lineRule="auto"/>
+        <w:ind w:left="317" w:hanging="317"/>
+        <w:jc w:val="both"/>
+      </w:pPr>
+      <w:r>
+        <w:rPr>
+          <w:rFonts w:ascii="Aptos" w:hAnsi="Aptos"/>
+          <w:b/>
+          <w:i w:val="0"/>
+          <w:color w:val="1E6A73"/>
+          <w:sz w:val="17"/>
+        </w:rPr>
+        <w:t xml:space="preserve">2. </w:t>
+      </w:r>
+      <w:r>
+        <w:rPr>
+          <w:rFonts w:ascii="Aptos" w:hAnsi="Aptos"/>
+          <w:b/>
+          <w:i w:val="0"/>
+          <w:color w:val="193654"/>
+          <w:sz w:val="17"/>
+        </w:rPr>
+        <w:t>Yuanyuan Hu</w:t>
+      </w:r>
+      <w:r>
+        <w:rPr>
+          <w:rFonts w:ascii="Aptos" w:hAnsi="Aptos"/>
+          <w:b w:val="0"/>
+          <w:i w:val="0"/>
+          <w:color w:val="20252B"/>
+          <w:sz w:val="17"/>
+        </w:rPr>
+        <w:t>#, Yancheng Tang#, Wei Li#, et al.</w:t>
+      </w:r>
+      <w:r>
+        <w:rPr>
+          <w:rFonts w:ascii="Aptos" w:hAnsi="Aptos"/>
+          <w:b w:val="0"/>
+          <w:i w:val="0"/>
+          <w:color w:val="20252B"/>
+          <w:sz w:val="17"/>
+        </w:rPr>
+        <w:t xml:space="preserve"> (2026). </w:t>
+      </w:r>
+      <w:hyperlink r:id="rId15">
+        <w:r>
+          <w:rPr>
+            <w:rFonts w:ascii="Aptos" w:hAnsi="Aptos"/>
+            <w:color w:val="1E6A73"/>
+            <w:sz w:val="17"/>
+            <w:szCs w:val="17"/>
+            <w:u w:val="single"/>
+          </w:rPr>
+          <w:t>Shared neurogenetic architecture links adolescent neurodevelopmental deviations to adult psychopathological procrastination</w:t>
+        </w:r>
+      </w:hyperlink>
+      <w:r>
+        <w:rPr>
+          <w:rFonts w:ascii="Aptos" w:hAnsi="Aptos"/>
+          <w:b w:val="0"/>
+          <w:i w:val="0"/>
+          <w:color w:val="20252B"/>
+          <w:sz w:val="17"/>
         </w:rPr>
         <w:t xml:space="preserve">. </w:t>
       </w:r>
       <w:r>
         <w:rPr>
-          <w:rFonts w:ascii="Calibri" w:hAnsi="Calibri"/>
+          <w:rFonts w:ascii="Aptos" w:hAnsi="Aptos"/>
           <w:b w:val="0"/>
-          <w:i w:val="0"/>
-          <w:color w:val="5F666E"/>
-          <w:sz w:val="14"/>
+          <w:i/>
+          <w:color w:val="20252B"/>
+          <w:sz w:val="17"/>
         </w:rPr>
-        <w:t xml:space="preserve">[Independent first author] </w:t>
+        <w:t>Molecular Psychiatry</w:t>
       </w:r>
       <w:r>
         <w:rPr>
-          <w:rFonts w:ascii="Calibri" w:hAnsi="Calibri"/>
+          <w:rFonts w:ascii="Aptos" w:hAnsi="Aptos"/>
           <w:b w:val="0"/>
           <w:i w:val="0"/>
-          <w:color w:val="5F666E"/>
-          <w:sz w:val="14"/>
+          <w:color w:val="20252B"/>
+          <w:sz w:val="17"/>
         </w:rPr>
-        <w:t>[SCI · Q1 · 5-year IF 10.6]</w:t>
+        <w:t>, 31(5), 2739–2753</w:t>
+      </w:r>
+      <w:r>
+        <w:rPr>
+          <w:rFonts w:ascii="Aptos" w:hAnsi="Aptos"/>
+          <w:b w:val="0"/>
+          <w:i w:val="0"/>
+          <w:color w:val="20252B"/>
+          <w:sz w:val="17"/>
+        </w:rPr>
+        <w:t>.</w:t>
+      </w:r>
+      <w:r>
+        <w:rPr>
+          <w:rFonts w:ascii="Aptos" w:hAnsi="Aptos"/>
+          <w:b w:val="0"/>
+          <w:i w:val="0"/>
+          <w:color w:val="5C646D"/>
+          <w:sz w:val="16"/>
+        </w:rPr>
+        <w:t xml:space="preserve">  Co-first author, 3 first authors | SCI · Q1 · 5-year IF 12.2</w:t>
       </w:r>
     </w:p>
     <w:p>
       <w:pPr>
-        <w:spacing w:before="0" w:after="40" w:line="254" w:lineRule="auto"/>
-        <w:ind w:left="288" w:hanging="288"/>
+        <w:keepLines/>
+        <w:spacing w:before="0" w:after="64" w:line="264" w:lineRule="auto"/>
+        <w:ind w:left="317" w:hanging="317"/>
         <w:jc w:val="both"/>
       </w:pPr>
       <w:r>
         <w:rPr>
-          <w:rFonts w:ascii="Calibri" w:hAnsi="Calibri"/>
+          <w:rFonts w:ascii="Aptos" w:hAnsi="Aptos"/>
           <w:b/>
           <w:i w:val="0"/>
-          <w:color w:val="3A5E8C"/>
-          <w:sz w:val="16"/>
+          <w:color w:val="1E6A73"/>
+          <w:sz w:val="17"/>
         </w:rPr>
-        <w:t xml:space="preserve">2. </w:t>
+        <w:t xml:space="preserve">3. </w:t>
       </w:r>
       <w:r>
         <w:rPr>
-          <w:rFonts w:ascii="Calibri" w:hAnsi="Calibri"/>
+          <w:rFonts w:ascii="Aptos" w:hAnsi="Aptos"/>
+          <w:b w:val="0"/>
+          <w:i w:val="0"/>
+          <w:color w:val="20252B"/>
+          <w:sz w:val="17"/>
+        </w:rPr>
+        <w:t xml:space="preserve">Zhiyi Chen#, Yancheng Tang#, Xuerong Liu, Wei Li#, </w:t>
+      </w:r>
+      <w:r>
+        <w:rPr>
+          <w:rFonts w:ascii="Aptos" w:hAnsi="Aptos"/>
           <w:b/>
           <w:i w:val="0"/>
-          <w:color w:val="1E3A5F"/>
-          <w:sz w:val="16"/>
+          <w:color w:val="193654"/>
+          <w:sz w:val="17"/>
         </w:rPr>
         <w:t>Yuanyuan Hu</w:t>
       </w:r>
       <w:r>
         <w:rPr>
-          <w:rFonts w:ascii="Calibri" w:hAnsi="Calibri"/>
+          <w:rFonts w:ascii="Aptos" w:hAnsi="Aptos"/>
           <w:b w:val="0"/>
           <w:i w:val="0"/>
-          <w:color w:val="262A2E"/>
-          <w:sz w:val="16"/>
+          <w:color w:val="20252B"/>
+          <w:sz w:val="17"/>
         </w:rPr>
-        <w:t>#, Yancheng Tang#, Wei Li#, Dang Zheng, Yuening Jin, Qingchen Fan, Jan K Buitelaar, Yuan Zhou &amp; Zhiyi Chen</w:t>
+        <w:t>#, et al.</w:t>
       </w:r>
       <w:r>
         <w:rPr>
-          <w:rFonts w:ascii="Calibri" w:hAnsi="Calibri"/>
+          <w:rFonts w:ascii="Aptos" w:hAnsi="Aptos"/>
           <w:b w:val="0"/>
           <w:i w:val="0"/>
-          <w:color w:val="262A2E"/>
-          <w:sz w:val="16"/>
+          <w:color w:val="20252B"/>
+          <w:sz w:val="17"/>
         </w:rPr>
-        <w:t xml:space="preserve"> (2026). </w:t>
+        <w:t xml:space="preserve"> (2024). </w:t>
       </w:r>
+      <w:hyperlink r:id="rId16">
+        <w:r>
+          <w:rPr>
+            <w:rFonts w:ascii="Aptos" w:hAnsi="Aptos"/>
+            <w:color w:val="1E6A73"/>
+            <w:sz w:val="17"/>
+            <w:szCs w:val="17"/>
+            <w:u w:val="single"/>
+          </w:rPr>
+          <w:t>Edge-centric connectome-genetic markers of bridging factor to comorbidity between depression and anxiety</w:t>
+        </w:r>
+      </w:hyperlink>
       <w:r>
         <w:rPr>
-          <w:rFonts w:ascii="Calibri" w:hAnsi="Calibri"/>
+          <w:rFonts w:ascii="Aptos" w:hAnsi="Aptos"/>
           <w:b w:val="0"/>
           <w:i w:val="0"/>
-          <w:color w:val="262A2E"/>
-          <w:sz w:val="16"/>
-        </w:rPr>
-        <w:t xml:space="preserve">Shared neurogenetic architecture links adolescent neurodevelopmental deviations to adult psychopathological procrastination. </w:t>
-      </w:r>
-      <w:r>
-        <w:rPr>
-          <w:rFonts w:ascii="Calibri" w:hAnsi="Calibri"/>
-          <w:b w:val="0"/>
-          <w:i/>
-          <w:color w:val="262A2E"/>
-          <w:sz w:val="16"/>
-        </w:rPr>
-        <w:t>Molecular Psychiatry</w:t>
-      </w:r>
-      <w:r>
-        <w:rPr>
-          <w:rFonts w:ascii="Calibri" w:hAnsi="Calibri"/>
-          <w:b w:val="0"/>
-          <w:i w:val="0"/>
-          <w:color w:val="262A2E"/>
-          <w:sz w:val="16"/>
-        </w:rPr>
-        <w:t>, 1–15</w:t>
-      </w:r>
-      <w:r>
-        <w:rPr>
-          <w:rFonts w:ascii="Calibri" w:hAnsi="Calibri"/>
-          <w:b w:val="0"/>
-          <w:i w:val="0"/>
-          <w:color w:val="262A2E"/>
-          <w:sz w:val="16"/>
+          <w:color w:val="20252B"/>
+          <w:sz w:val="17"/>
         </w:rPr>
         <w:t xml:space="preserve">. </w:t>
       </w:r>
       <w:r>
         <w:rPr>
-          <w:rFonts w:ascii="Calibri" w:hAnsi="Calibri"/>
+          <w:rFonts w:ascii="Aptos" w:hAnsi="Aptos"/>
           <w:b w:val="0"/>
-          <w:i w:val="0"/>
-          <w:color w:val="5F666E"/>
-          <w:sz w:val="14"/>
+          <w:i/>
+          <w:color w:val="20252B"/>
+          <w:sz w:val="17"/>
         </w:rPr>
-        <w:t xml:space="preserve">[Co-first author, 3 first authors] </w:t>
+        <w:t>Nature Communications</w:t>
       </w:r>
       <w:r>
         <w:rPr>
-          <w:rFonts w:ascii="Calibri" w:hAnsi="Calibri"/>
+          <w:rFonts w:ascii="Aptos" w:hAnsi="Aptos"/>
           <w:b w:val="0"/>
           <w:i w:val="0"/>
-          <w:color w:val="5F666E"/>
-          <w:sz w:val="14"/>
+          <w:color w:val="20252B"/>
+          <w:sz w:val="17"/>
         </w:rPr>
-        <w:t>[SCI · Q1 · 5-year IF 12.2]</w:t>
+        <w:t>, 15, 10560</w:t>
+      </w:r>
+      <w:r>
+        <w:rPr>
+          <w:rFonts w:ascii="Aptos" w:hAnsi="Aptos"/>
+          <w:b w:val="0"/>
+          <w:i w:val="0"/>
+          <w:color w:val="20252B"/>
+          <w:sz w:val="17"/>
+        </w:rPr>
+        <w:t>.</w:t>
+      </w:r>
+      <w:r>
+        <w:rPr>
+          <w:rFonts w:ascii="Aptos" w:hAnsi="Aptos"/>
+          <w:b w:val="0"/>
+          <w:i w:val="0"/>
+          <w:color w:val="5C646D"/>
+          <w:sz w:val="16"/>
+        </w:rPr>
+        <w:t xml:space="preserve">  Co-first author, 5 first authors | SCI · Q1 · 5-year IF 18.9</w:t>
       </w:r>
     </w:p>
     <w:p>
       <w:pPr>
-        <w:spacing w:before="0" w:after="40" w:line="254" w:lineRule="auto"/>
-        <w:ind w:left="288" w:hanging="288"/>
+        <w:keepLines/>
+        <w:spacing w:before="0" w:after="64" w:line="264" w:lineRule="auto"/>
+        <w:ind w:left="317" w:hanging="317"/>
         <w:jc w:val="both"/>
       </w:pPr>
       <w:r>
         <w:rPr>
-          <w:rFonts w:ascii="Calibri" w:hAnsi="Calibri"/>
+          <w:rFonts w:ascii="Aptos" w:hAnsi="Aptos"/>
           <w:b/>
           <w:i w:val="0"/>
-          <w:color w:val="3A5E8C"/>
-          <w:sz w:val="16"/>
+          <w:color w:val="1E6A73"/>
+          <w:sz w:val="17"/>
         </w:rPr>
-        <w:t xml:space="preserve">3. </w:t>
+        <w:t xml:space="preserve">4. </w:t>
       </w:r>
       <w:r>
         <w:rPr>
-          <w:rFonts w:ascii="Calibri" w:hAnsi="Calibri"/>
-          <w:b w:val="0"/>
-          <w:i w:val="0"/>
-          <w:color w:val="262A2E"/>
-          <w:sz w:val="16"/>
-        </w:rPr>
-        <w:t xml:space="preserve">Zhiyi Chen#, Yancheng Tang#, Xuerong Liu, Wei Li#, </w:t>
-      </w:r>
-      <w:r>
-        <w:rPr>
-          <w:rFonts w:ascii="Calibri" w:hAnsi="Calibri"/>
+          <w:rFonts w:ascii="Aptos" w:hAnsi="Aptos"/>
           <w:b/>
           <w:i w:val="0"/>
-          <w:color w:val="1E3A5F"/>
-          <w:sz w:val="16"/>
+          <w:color w:val="193654"/>
+          <w:sz w:val="17"/>
         </w:rPr>
         <w:t>Yuanyuan Hu</w:t>
       </w:r>
       <w:r>
         <w:rPr>
-          <w:rFonts w:ascii="Calibri" w:hAnsi="Calibri"/>
+          <w:rFonts w:ascii="Aptos" w:hAnsi="Aptos"/>
           <w:b w:val="0"/>
           <w:i w:val="0"/>
-          <w:color w:val="262A2E"/>
-          <w:sz w:val="16"/>
+          <w:color w:val="20252B"/>
+          <w:sz w:val="17"/>
         </w:rPr>
-        <w:t>#, Bowen Hu#, Ting Xu, Rong Zhang, Lei Xia, Jing-Xuan Zhang, Zhibing Xiao, Ji Chen, Zhengzhi Feng, Yuan Zhou, Qinghua He, Jiang Qiu, Xu Lei, Hong Chen, Shaozheng Qin &amp; Tingyong Feng</w:t>
+        <w:t>#, Yuening Jin#, Bowen Hu, et al.</w:t>
       </w:r>
       <w:r>
         <w:rPr>
-          <w:rFonts w:ascii="Calibri" w:hAnsi="Calibri"/>
+          <w:rFonts w:ascii="Aptos" w:hAnsi="Aptos"/>
           <w:b w:val="0"/>
           <w:i w:val="0"/>
-          <w:color w:val="262A2E"/>
-          <w:sz w:val="16"/>
+          <w:color w:val="20252B"/>
+          <w:sz w:val="17"/>
         </w:rPr>
         <w:t xml:space="preserve"> (2024). </w:t>
       </w:r>
+      <w:hyperlink r:id="rId17">
+        <w:r>
+          <w:rPr>
+            <w:rFonts w:ascii="Aptos" w:hAnsi="Aptos"/>
+            <w:color w:val="1E6A73"/>
+            <w:sz w:val="17"/>
+            <w:szCs w:val="17"/>
+            <w:u w:val="single"/>
+          </w:rPr>
+          <w:t>Computational modeling interpretation underlying elevated risk-taking propensity in the dynamic risky investment process of non-labor income</w:t>
+        </w:r>
+      </w:hyperlink>
       <w:r>
         <w:rPr>
-          <w:rFonts w:ascii="Calibri" w:hAnsi="Calibri"/>
+          <w:rFonts w:ascii="Aptos" w:hAnsi="Aptos"/>
           <w:b w:val="0"/>
           <w:i w:val="0"/>
-          <w:color w:val="262A2E"/>
-          <w:sz w:val="16"/>
-        </w:rPr>
-        <w:t xml:space="preserve">Edge-centric connectome-genetic markers of bridging factor to comorbidity between depression and anxiety. </w:t>
-      </w:r>
-      <w:r>
-        <w:rPr>
-          <w:rFonts w:ascii="Calibri" w:hAnsi="Calibri"/>
-          <w:b w:val="0"/>
-          <w:i/>
-          <w:color w:val="262A2E"/>
-          <w:sz w:val="16"/>
-        </w:rPr>
-        <w:t>Nature Communications</w:t>
-      </w:r>
-      <w:r>
-        <w:rPr>
-          <w:rFonts w:ascii="Calibri" w:hAnsi="Calibri"/>
-          <w:b w:val="0"/>
-          <w:i w:val="0"/>
-          <w:color w:val="262A2E"/>
-          <w:sz w:val="16"/>
-        </w:rPr>
-        <w:t>, 15(1), 1–15</w:t>
-      </w:r>
-      <w:r>
-        <w:rPr>
-          <w:rFonts w:ascii="Calibri" w:hAnsi="Calibri"/>
-          <w:b w:val="0"/>
-          <w:i w:val="0"/>
-          <w:color w:val="262A2E"/>
-          <w:sz w:val="16"/>
+          <w:color w:val="20252B"/>
+          <w:sz w:val="17"/>
         </w:rPr>
         <w:t xml:space="preserve">. </w:t>
       </w:r>
       <w:r>
         <w:rPr>
-          <w:rFonts w:ascii="Calibri" w:hAnsi="Calibri"/>
+          <w:rFonts w:ascii="Aptos" w:hAnsi="Aptos"/>
           <w:b w:val="0"/>
-          <w:i w:val="0"/>
-          <w:color w:val="5F666E"/>
-          <w:sz w:val="14"/>
+          <w:i/>
+          <w:color w:val="20252B"/>
+          <w:sz w:val="17"/>
         </w:rPr>
-        <w:t xml:space="preserve">[Co-first author, 5 first authors] </w:t>
+        <w:t>Psychology Research and Behavior Management</w:t>
       </w:r>
       <w:r>
         <w:rPr>
-          <w:rFonts w:ascii="Calibri" w:hAnsi="Calibri"/>
+          <w:rFonts w:ascii="Aptos" w:hAnsi="Aptos"/>
           <w:b w:val="0"/>
           <w:i w:val="0"/>
-          <w:color w:val="5F666E"/>
-          <w:sz w:val="14"/>
+          <w:color w:val="20252B"/>
+          <w:sz w:val="17"/>
         </w:rPr>
-        <w:t>[SCI · Q1 · 5-year IF 18.9]</w:t>
+        <w:t>, 17, 2491–2504</w:t>
+      </w:r>
+      <w:r>
+        <w:rPr>
+          <w:rFonts w:ascii="Aptos" w:hAnsi="Aptos"/>
+          <w:b w:val="0"/>
+          <w:i w:val="0"/>
+          <w:color w:val="20252B"/>
+          <w:sz w:val="17"/>
+        </w:rPr>
+        <w:t>.</w:t>
+      </w:r>
+      <w:r>
+        <w:rPr>
+          <w:rFonts w:ascii="Aptos" w:hAnsi="Aptos"/>
+          <w:b w:val="0"/>
+          <w:i w:val="0"/>
+          <w:color w:val="5C646D"/>
+          <w:sz w:val="16"/>
+        </w:rPr>
+        <w:t xml:space="preserve">  Co-first author, 2 first authors | SSCI · Q1 · 5-year IF 4.5</w:t>
       </w:r>
     </w:p>
     <w:p>
       <w:pPr>
-        <w:spacing w:before="0" w:after="40" w:line="254" w:lineRule="auto"/>
-        <w:ind w:left="288" w:hanging="288"/>
+        <w:keepLines/>
+        <w:spacing w:before="0" w:after="64" w:line="264" w:lineRule="auto"/>
+        <w:ind w:left="317" w:hanging="317"/>
         <w:jc w:val="both"/>
       </w:pPr>
       <w:r>
         <w:rPr>
-          <w:rFonts w:ascii="Calibri" w:hAnsi="Calibri"/>
+          <w:rFonts w:ascii="Aptos" w:hAnsi="Aptos"/>
           <w:b/>
           <w:i w:val="0"/>
-          <w:color w:val="3A5E8C"/>
-          <w:sz w:val="16"/>
+          <w:color w:val="1E6A73"/>
+          <w:sz w:val="17"/>
         </w:rPr>
-        <w:t xml:space="preserve">4. </w:t>
+        <w:t xml:space="preserve">5. </w:t>
       </w:r>
       <w:r>
         <w:rPr>
-          <w:rFonts w:ascii="Calibri" w:hAnsi="Calibri"/>
+          <w:rFonts w:ascii="Aptos" w:hAnsi="Aptos"/>
           <w:b/>
           <w:i w:val="0"/>
-          <w:color w:val="1E3A5F"/>
-          <w:sz w:val="16"/>
+          <w:color w:val="193654"/>
+          <w:sz w:val="17"/>
         </w:rPr>
         <w:t>Yuanyuan Hu</w:t>
       </w:r>
       <w:r>
         <w:rPr>
-          <w:rFonts w:ascii="Calibri" w:hAnsi="Calibri"/>
+          <w:rFonts w:ascii="Aptos" w:hAnsi="Aptos"/>
           <w:b w:val="0"/>
           <w:i w:val="0"/>
-          <w:color w:val="262A2E"/>
-          <w:sz w:val="16"/>
+          <w:color w:val="20252B"/>
+          <w:sz w:val="17"/>
         </w:rPr>
-        <w:t>#, Yuening Jin#, Bowen Hu, Tingyong Feng &amp; Yuan Zhou</w:t>
+        <w:t>#, Jingjie Zhao#, Yuening Jin, et al.</w:t>
       </w:r>
       <w:r>
         <w:rPr>
-          <w:rFonts w:ascii="Calibri" w:hAnsi="Calibri"/>
+          <w:rFonts w:ascii="Aptos" w:hAnsi="Aptos"/>
           <w:b w:val="0"/>
           <w:i w:val="0"/>
-          <w:color w:val="262A2E"/>
-          <w:sz w:val="16"/>
+          <w:color w:val="20252B"/>
+          <w:sz w:val="17"/>
         </w:rPr>
         <w:t xml:space="preserve"> (2024). </w:t>
       </w:r>
+      <w:hyperlink r:id="rId18">
+        <w:r>
+          <w:rPr>
+            <w:rFonts w:ascii="Aptos" w:hAnsi="Aptos"/>
+            <w:color w:val="1E6A73"/>
+            <w:sz w:val="17"/>
+            <w:szCs w:val="17"/>
+            <w:u w:val="single"/>
+          </w:rPr>
+          <w:t>The altered resting-state functional connectivity of thalamic subregions in patients with globus pharyngeus</w:t>
+        </w:r>
+      </w:hyperlink>
       <w:r>
         <w:rPr>
-          <w:rFonts w:ascii="Calibri" w:hAnsi="Calibri"/>
+          <w:rFonts w:ascii="Aptos" w:hAnsi="Aptos"/>
           <w:b w:val="0"/>
           <w:i w:val="0"/>
-          <w:color w:val="262A2E"/>
-          <w:sz w:val="16"/>
-        </w:rPr>
-        <w:t xml:space="preserve">Computational modeling interpretation underlying elevated risk-taking propensity in the dynamic risky investment process of non-labor income. </w:t>
-      </w:r>
-      <w:r>
-        <w:rPr>
-          <w:rFonts w:ascii="Calibri" w:hAnsi="Calibri"/>
-          <w:b w:val="0"/>
-          <w:i/>
-          <w:color w:val="262A2E"/>
-          <w:sz w:val="16"/>
-        </w:rPr>
-        <w:t>Psychology Research and Behavior Management</w:t>
-      </w:r>
-      <w:r>
-        <w:rPr>
-          <w:rFonts w:ascii="Calibri" w:hAnsi="Calibri"/>
-          <w:b w:val="0"/>
-          <w:i w:val="0"/>
-          <w:color w:val="262A2E"/>
-          <w:sz w:val="16"/>
-        </w:rPr>
-        <w:t>, 2491–2504</w:t>
-      </w:r>
-      <w:r>
-        <w:rPr>
-          <w:rFonts w:ascii="Calibri" w:hAnsi="Calibri"/>
-          <w:b w:val="0"/>
-          <w:i w:val="0"/>
-          <w:color w:val="262A2E"/>
-          <w:sz w:val="16"/>
+          <w:color w:val="20252B"/>
+          <w:sz w:val="17"/>
         </w:rPr>
         <w:t xml:space="preserve">. </w:t>
       </w:r>
       <w:r>
         <w:rPr>
-          <w:rFonts w:ascii="Calibri" w:hAnsi="Calibri"/>
-          <w:b w:val="0"/>
-          <w:i w:val="0"/>
-          <w:color w:val="5F666E"/>
-          <w:sz w:val="14"/>
-        </w:rPr>
-        <w:t xml:space="preserve">[Co-first author, 2 first authors] </w:t>
-      </w:r>
-      <w:r>
-        <w:rPr>
-          <w:rFonts w:ascii="Calibri" w:hAnsi="Calibri"/>
-          <w:b w:val="0"/>
-          <w:i w:val="0"/>
-          <w:color w:val="5F666E"/>
-          <w:sz w:val="14"/>
-        </w:rPr>
-        <w:t>[SSCI · Q1 · 5-year IF 4.5]</w:t>
-      </w:r>
-    </w:p>
-    <w:p>
-      <w:pPr>
-        <w:spacing w:before="0" w:after="40" w:line="254" w:lineRule="auto"/>
-        <w:ind w:left="288" w:hanging="288"/>
-        <w:jc w:val="both"/>
-      </w:pPr>
-      <w:r>
-        <w:rPr>
-          <w:rFonts w:ascii="Calibri" w:hAnsi="Calibri"/>
-          <w:b/>
-          <w:i w:val="0"/>
-          <w:color w:val="3A5E8C"/>
-          <w:sz w:val="16"/>
-        </w:rPr>
-        <w:t xml:space="preserve">5. </w:t>
-      </w:r>
-      <w:r>
-        <w:rPr>
-          <w:rFonts w:ascii="Calibri" w:hAnsi="Calibri"/>
-          <w:b/>
-          <w:i w:val="0"/>
-          <w:color w:val="1E3A5F"/>
-          <w:sz w:val="16"/>
-        </w:rPr>
-        <w:t>Yuanyuan Hu</w:t>
-      </w:r>
-      <w:r>
-        <w:rPr>
-          <w:rFonts w:ascii="Calibri" w:hAnsi="Calibri"/>
-          <w:b w:val="0"/>
-          <w:i w:val="0"/>
-          <w:color w:val="262A2E"/>
-          <w:sz w:val="16"/>
-        </w:rPr>
-        <w:t>#, Jingjie Zhao#, Yuening Jin, Yi Du, Qian Zhao, Shuai Xu, Li Li &amp; Yuan Zhou</w:t>
-      </w:r>
-      <w:r>
-        <w:rPr>
-          <w:rFonts w:ascii="Calibri" w:hAnsi="Calibri"/>
-          <w:b w:val="0"/>
-          <w:i w:val="0"/>
-          <w:color w:val="262A2E"/>
-          <w:sz w:val="16"/>
-        </w:rPr>
-        <w:t xml:space="preserve"> (2024). </w:t>
-      </w:r>
-      <w:r>
-        <w:rPr>
-          <w:rFonts w:ascii="Calibri" w:hAnsi="Calibri"/>
-          <w:b w:val="0"/>
-          <w:i w:val="0"/>
-          <w:color w:val="262A2E"/>
-          <w:sz w:val="16"/>
-        </w:rPr>
-        <w:t xml:space="preserve">The altered resting-state functional connectivity of thalamic subregions in patients with globus pharyngeus. </w:t>
-      </w:r>
-      <w:r>
-        <w:rPr>
-          <w:rFonts w:ascii="Calibri" w:hAnsi="Calibri"/>
+          <w:rFonts w:ascii="Aptos" w:hAnsi="Aptos"/>
           <w:b w:val="0"/>
           <w:i/>
-          <w:color w:val="262A2E"/>
-          <w:sz w:val="16"/>
+          <w:color w:val="20252B"/>
+          <w:sz w:val="17"/>
         </w:rPr>
         <w:t>Brain Imaging and Behavior</w:t>
       </w:r>
       <w:r>
         <w:rPr>
-          <w:rFonts w:ascii="Calibri" w:hAnsi="Calibri"/>
+          <w:rFonts w:ascii="Aptos" w:hAnsi="Aptos"/>
           <w:b w:val="0"/>
           <w:i w:val="0"/>
-          <w:color w:val="262A2E"/>
-          <w:sz w:val="16"/>
+          <w:color w:val="20252B"/>
+          <w:sz w:val="17"/>
         </w:rPr>
-        <w:t>, 1–9</w:t>
+        <w:t>, 19(1), 23–31</w:t>
       </w:r>
       <w:r>
         <w:rPr>
-          <w:rFonts w:ascii="Calibri" w:hAnsi="Calibri"/>
+          <w:rFonts w:ascii="Aptos" w:hAnsi="Aptos"/>
           <w:b w:val="0"/>
           <w:i w:val="0"/>
-          <w:color w:val="262A2E"/>
-          <w:sz w:val="16"/>
+          <w:color w:val="20252B"/>
+          <w:sz w:val="17"/>
         </w:rPr>
-        <w:t xml:space="preserve">. </w:t>
+        <w:t>.</w:t>
       </w:r>
       <w:r>
         <w:rPr>
-          <w:rFonts w:ascii="Calibri" w:hAnsi="Calibri"/>
+          <w:rFonts w:ascii="Aptos" w:hAnsi="Aptos"/>
           <w:b w:val="0"/>
           <w:i w:val="0"/>
-          <w:color w:val="5F666E"/>
-          <w:sz w:val="14"/>
+          <w:color w:val="5C646D"/>
+          <w:sz w:val="16"/>
         </w:rPr>
-        <w:t xml:space="preserve">[Co-first author, 2 first authors] </w:t>
-      </w:r>
-      <w:r>
-        <w:rPr>
-          <w:rFonts w:ascii="Calibri" w:hAnsi="Calibri"/>
-          <w:b w:val="0"/>
-          <w:i w:val="0"/>
-          <w:color w:val="5F666E"/>
-          <w:sz w:val="14"/>
-        </w:rPr>
-        <w:t>[SCI · Q2 · 5-year IF 3.1]</w:t>
+        <w:t xml:space="preserve">  Co-first author, 2 first authors | SCI · Q2 · 5-year IF 3.1</w:t>
       </w:r>
     </w:p>
     <w:p>
       <w:pPr>
-        <w:spacing w:before="40" w:after="20" w:line="240" w:lineRule="auto"/>
-        <w:jc w:val="both"/>
-      </w:pPr>
-      <w:r>
-        <w:rPr>
-          <w:rFonts w:ascii="Calibri" w:hAnsi="Calibri"/>
-          <w:b/>
-          <w:i w:val="0"/>
-          <w:color w:val="5F666E"/>
-          <w:sz w:val="16"/>
-        </w:rPr>
-        <w:t>Collaborative publications</w:t>
-      </w:r>
-    </w:p>
-    <w:p>
-      <w:pPr>
-        <w:spacing w:before="0" w:after="40" w:line="254" w:lineRule="auto"/>
-        <w:ind w:left="288" w:hanging="288"/>
-        <w:jc w:val="both"/>
-      </w:pPr>
-      <w:r>
-        <w:rPr>
-          <w:rFonts w:ascii="Calibri" w:hAnsi="Calibri"/>
-          <w:b/>
-          <w:i w:val="0"/>
-          <w:color w:val="3A5E8C"/>
-          <w:sz w:val="16"/>
-        </w:rPr>
-        <w:t xml:space="preserve">1. </w:t>
-      </w:r>
-      <w:r>
-        <w:rPr>
-          <w:rFonts w:ascii="Calibri" w:hAnsi="Calibri"/>
-          <w:b w:val="0"/>
-          <w:i w:val="0"/>
-          <w:color w:val="262A2E"/>
-          <w:sz w:val="16"/>
-        </w:rPr>
-        <w:t xml:space="preserve">Yuening Jin, Dang Zheng, Ruolei Gu, Qingchen Fan, Martin Dietz, Changshuo Wang, Xinying Li, Jie Chen, </w:t>
-      </w:r>
-      <w:r>
-        <w:rPr>
-          <w:rFonts w:ascii="Calibri" w:hAnsi="Calibri"/>
-          <w:b/>
-          <w:i w:val="0"/>
-          <w:color w:val="1E3A5F"/>
-          <w:sz w:val="16"/>
-        </w:rPr>
-        <w:t>Yuanyuan Hu</w:t>
-      </w:r>
-      <w:r>
-        <w:rPr>
-          <w:rFonts w:ascii="Calibri" w:hAnsi="Calibri"/>
-          <w:b w:val="0"/>
-          <w:i w:val="0"/>
-          <w:color w:val="262A2E"/>
-          <w:sz w:val="16"/>
-        </w:rPr>
-        <w:t xml:space="preserve"> &amp; Yuan Zhou</w:t>
-      </w:r>
-      <w:r>
-        <w:rPr>
-          <w:rFonts w:ascii="Calibri" w:hAnsi="Calibri"/>
-          <w:b w:val="0"/>
-          <w:i w:val="0"/>
-          <w:color w:val="262A2E"/>
-          <w:sz w:val="16"/>
-        </w:rPr>
-        <w:t xml:space="preserve"> (2024). </w:t>
-      </w:r>
-      <w:r>
-        <w:rPr>
-          <w:rFonts w:ascii="Calibri" w:hAnsi="Calibri"/>
-          <w:b w:val="0"/>
-          <w:i w:val="0"/>
-          <w:color w:val="262A2E"/>
-          <w:sz w:val="16"/>
-        </w:rPr>
-        <w:t xml:space="preserve">Substantial heritability underlies fairness norm adaptation capability and its neural basis. </w:t>
-      </w:r>
-      <w:r>
-        <w:rPr>
-          <w:rFonts w:ascii="Calibri" w:hAnsi="Calibri"/>
-          <w:b w:val="0"/>
-          <w:i/>
-          <w:color w:val="262A2E"/>
-          <w:sz w:val="16"/>
-        </w:rPr>
-        <w:t>Advanced Science</w:t>
-      </w:r>
-      <w:r>
-        <w:rPr>
-          <w:rFonts w:ascii="Calibri" w:hAnsi="Calibri"/>
-          <w:b w:val="0"/>
-          <w:i w:val="0"/>
-          <w:color w:val="262A2E"/>
-          <w:sz w:val="16"/>
-        </w:rPr>
-        <w:t>, 2411070</w:t>
-      </w:r>
-      <w:r>
-        <w:rPr>
-          <w:rFonts w:ascii="Calibri" w:hAnsi="Calibri"/>
-          <w:b w:val="0"/>
-          <w:i w:val="0"/>
-          <w:color w:val="262A2E"/>
-          <w:sz w:val="16"/>
-        </w:rPr>
-        <w:t xml:space="preserve">. </w:t>
-      </w:r>
-      <w:r>
-        <w:rPr>
-          <w:rFonts w:ascii="Calibri" w:hAnsi="Calibri"/>
-          <w:b w:val="0"/>
-          <w:i w:val="0"/>
-          <w:color w:val="5F666E"/>
-          <w:sz w:val="14"/>
-        </w:rPr>
-        <w:t>[SCI · Q1 · 5-year IF 16.3]</w:t>
-      </w:r>
-    </w:p>
-    <w:p>
-      <w:pPr>
-        <w:spacing w:before="0" w:after="40" w:line="254" w:lineRule="auto"/>
-        <w:ind w:left="288" w:hanging="288"/>
-        <w:jc w:val="both"/>
-      </w:pPr>
-      <w:r>
-        <w:rPr>
-          <w:rFonts w:ascii="Calibri" w:hAnsi="Calibri"/>
-          <w:b/>
-          <w:i w:val="0"/>
-          <w:color w:val="3A5E8C"/>
-          <w:sz w:val="16"/>
-        </w:rPr>
-        <w:t xml:space="preserve">2. </w:t>
-      </w:r>
-      <w:r>
-        <w:rPr>
-          <w:rFonts w:ascii="Calibri" w:hAnsi="Calibri"/>
-          <w:b w:val="0"/>
-          <w:i w:val="0"/>
-          <w:color w:val="262A2E"/>
-          <w:sz w:val="16"/>
-        </w:rPr>
-        <w:t xml:space="preserve">Wei Li, Xue-rong Liu, Qianyu Zhang, Lei Xia, Yanyan Li, Xiaobing Tian, Jie Gong, Jidong Ren, Chang Shen, Yi Wu, Ji Chen, Chuan-Peng Hu, Jing-Xuan Zhang, Ting Xu, </w:t>
-      </w:r>
-      <w:r>
-        <w:rPr>
-          <w:rFonts w:ascii="Calibri" w:hAnsi="Calibri"/>
-          <w:b/>
-          <w:i w:val="0"/>
-          <w:color w:val="1E3A5F"/>
-          <w:sz w:val="16"/>
-        </w:rPr>
-        <w:t>Yuanyuan Hu</w:t>
-      </w:r>
-      <w:r>
-        <w:rPr>
-          <w:rFonts w:ascii="Calibri" w:hAnsi="Calibri"/>
-          <w:b w:val="0"/>
-          <w:i w:val="0"/>
-          <w:color w:val="262A2E"/>
-          <w:sz w:val="16"/>
-        </w:rPr>
-        <w:t>, Bowen Hu, Ni Yan, Tingyong Feng, Zhengzhi Feng &amp; Zhiyi Chen</w:t>
-      </w:r>
-      <w:r>
-        <w:rPr>
-          <w:rFonts w:ascii="Calibri" w:hAnsi="Calibri"/>
-          <w:b w:val="0"/>
-          <w:i w:val="0"/>
-          <w:color w:val="262A2E"/>
-          <w:sz w:val="16"/>
-        </w:rPr>
-        <w:t xml:space="preserve"> (2025). </w:t>
-      </w:r>
-      <w:r>
-        <w:rPr>
-          <w:rFonts w:ascii="Calibri" w:hAnsi="Calibri"/>
-          <w:b w:val="0"/>
-          <w:i w:val="0"/>
-          <w:color w:val="262A2E"/>
-          <w:sz w:val="16"/>
-        </w:rPr>
-        <w:t xml:space="preserve">Implementation of primary psychological healthcare policy to address the risk of depression in underprivileged children and adolescents, in the entire lower-middle-economic-status city of China: an observational, multicenter, and single-arm cohort study. </w:t>
-      </w:r>
-      <w:r>
-        <w:rPr>
-          <w:rFonts w:ascii="Calibri" w:hAnsi="Calibri"/>
-          <w:b w:val="0"/>
-          <w:i/>
-          <w:color w:val="262A2E"/>
-          <w:sz w:val="16"/>
-        </w:rPr>
-        <w:t>Depression and Anxiety</w:t>
-      </w:r>
-      <w:r>
-        <w:rPr>
-          <w:rFonts w:ascii="Calibri" w:hAnsi="Calibri"/>
-          <w:b w:val="0"/>
-          <w:i w:val="0"/>
-          <w:color w:val="262A2E"/>
-          <w:sz w:val="16"/>
-        </w:rPr>
-        <w:t>, 2025(1), 5572365</w:t>
-      </w:r>
-      <w:r>
-        <w:rPr>
-          <w:rFonts w:ascii="Calibri" w:hAnsi="Calibri"/>
-          <w:b w:val="0"/>
-          <w:i w:val="0"/>
-          <w:color w:val="262A2E"/>
-          <w:sz w:val="16"/>
-        </w:rPr>
-        <w:t xml:space="preserve">. </w:t>
-      </w:r>
-      <w:r>
-        <w:rPr>
-          <w:rFonts w:ascii="Calibri" w:hAnsi="Calibri"/>
-          <w:b w:val="0"/>
-          <w:i w:val="0"/>
-          <w:color w:val="5F666E"/>
-          <w:sz w:val="14"/>
-        </w:rPr>
-        <w:t>[SCI · Q1 · 5-year IF 6.3]</w:t>
-      </w:r>
-    </w:p>
-    <w:p>
-      <w:pPr>
-        <w:spacing w:before="0" w:after="40" w:line="254" w:lineRule="auto"/>
-        <w:ind w:left="288" w:hanging="288"/>
-        <w:jc w:val="both"/>
-      </w:pPr>
-      <w:r>
-        <w:rPr>
-          <w:rFonts w:ascii="Calibri" w:hAnsi="Calibri"/>
-          <w:b/>
-          <w:i w:val="0"/>
-          <w:color w:val="3A5E8C"/>
-          <w:sz w:val="16"/>
-        </w:rPr>
-        <w:t xml:space="preserve">3. </w:t>
-      </w:r>
-      <w:r>
-        <w:rPr>
-          <w:rFonts w:ascii="Calibri" w:hAnsi="Calibri"/>
-          <w:b w:val="0"/>
-          <w:i w:val="0"/>
-          <w:color w:val="262A2E"/>
-          <w:sz w:val="16"/>
-        </w:rPr>
-        <w:t xml:space="preserve">Bowen Hu, Tongxi Yang, </w:t>
-      </w:r>
-      <w:r>
-        <w:rPr>
-          <w:rFonts w:ascii="Calibri" w:hAnsi="Calibri"/>
-          <w:b/>
-          <w:i w:val="0"/>
-          <w:color w:val="1E3A5F"/>
-          <w:sz w:val="16"/>
-        </w:rPr>
-        <w:t>Yuanyuan Hu</w:t>
-      </w:r>
-      <w:r>
-        <w:rPr>
-          <w:rFonts w:ascii="Calibri" w:hAnsi="Calibri"/>
-          <w:b w:val="0"/>
-          <w:i w:val="0"/>
-          <w:color w:val="262A2E"/>
-          <w:sz w:val="16"/>
-        </w:rPr>
-        <w:t>, M. Liu, S. Tan, X. Li &amp; Shaozheng Qin</w:t>
-      </w:r>
-      <w:r>
-        <w:rPr>
-          <w:rFonts w:ascii="Calibri" w:hAnsi="Calibri"/>
-          <w:b w:val="0"/>
-          <w:i w:val="0"/>
-          <w:color w:val="262A2E"/>
-          <w:sz w:val="16"/>
-        </w:rPr>
-        <w:t xml:space="preserve"> (2026). </w:t>
-      </w:r>
-      <w:r>
-        <w:rPr>
-          <w:rFonts w:ascii="Calibri" w:hAnsi="Calibri"/>
-          <w:b w:val="0"/>
-          <w:i w:val="0"/>
-          <w:color w:val="262A2E"/>
-          <w:sz w:val="16"/>
-        </w:rPr>
-        <w:t xml:space="preserve">Neurobehavioral Profiles of Inhibitory-Control Stratify Vulnerability and Resilience under Childhood Poverty. </w:t>
-      </w:r>
-      <w:r>
-        <w:rPr>
-          <w:rFonts w:ascii="Calibri" w:hAnsi="Calibri"/>
-          <w:b w:val="0"/>
-          <w:i/>
-          <w:color w:val="262A2E"/>
-          <w:sz w:val="16"/>
-        </w:rPr>
-        <w:t>medRxiv</w:t>
-      </w:r>
-      <w:r>
-        <w:rPr>
-          <w:rFonts w:ascii="Calibri" w:hAnsi="Calibri"/>
-          <w:b w:val="0"/>
-          <w:i w:val="0"/>
-          <w:color w:val="262A2E"/>
-          <w:sz w:val="16"/>
-        </w:rPr>
-        <w:t>, 2026-04</w:t>
-      </w:r>
-      <w:r>
-        <w:rPr>
-          <w:rFonts w:ascii="Calibri" w:hAnsi="Calibri"/>
-          <w:b w:val="0"/>
-          <w:i w:val="0"/>
-          <w:color w:val="262A2E"/>
-          <w:sz w:val="16"/>
-        </w:rPr>
-        <w:t xml:space="preserve">. </w:t>
-      </w:r>
-      <w:r>
-        <w:rPr>
-          <w:rFonts w:ascii="Calibri" w:hAnsi="Calibri"/>
-          <w:b w:val="0"/>
-          <w:i w:val="0"/>
-          <w:color w:val="5F666E"/>
-          <w:sz w:val="14"/>
-        </w:rPr>
-        <w:t>[Preprint]</w:t>
-      </w:r>
-    </w:p>
-    <w:p>
-      <w:pPr>
-        <w:spacing w:before="40" w:after="0" w:line="240" w:lineRule="auto"/>
-        <w:jc w:val="both"/>
-      </w:pPr>
-      <w:r>
-        <w:rPr>
-          <w:rFonts w:ascii="Calibri" w:hAnsi="Calibri"/>
-          <w:b w:val="0"/>
-          <w:i/>
-          <w:color w:val="5F666E"/>
-          <w:sz w:val="14"/>
-        </w:rPr>
-        <w:t># indicates equal contribution.</w:t>
-      </w:r>
-    </w:p>
-    <w:p>
-      <w:pPr>
-        <w:spacing w:before="40" w:after="0" w:line="240" w:lineRule="auto"/>
+        <w:keepLines w:val="0"/>
+        <w:spacing w:before="20" w:after="0" w:line="240" w:lineRule="auto"/>
         <w:jc w:val="center"/>
       </w:pPr>
       <w:r>
         <w:rPr>
-          <w:rFonts w:ascii="Calibri" w:hAnsi="Calibri"/>
+          <w:rFonts w:ascii="Aptos" w:hAnsi="Aptos"/>
+          <w:b w:val="0"/>
+          <w:i/>
+          <w:color w:val="5C646D"/>
+          <w:sz w:val="14"/>
+        </w:rPr>
+        <w:t xml:space="preserve"># Equal contribution. Full author lists and collaborative publications: </w:t>
+      </w:r>
+      <w:hyperlink r:id="rId19">
+        <w:r>
+          <w:rPr>
+            <w:rFonts w:ascii="Aptos" w:hAnsi="Aptos"/>
+            <w:color w:val="1E6A73"/>
+            <w:sz w:val="14"/>
+            <w:szCs w:val="14"/>
+            <w:u w:val="single"/>
+          </w:rPr>
+          <w:t>Extended CV</w:t>
+        </w:r>
+      </w:hyperlink>
+      <w:r>
+        <w:rPr>
+          <w:rFonts w:ascii="Aptos" w:hAnsi="Aptos"/>
           <w:b w:val="0"/>
           <w:i w:val="0"/>
-          <w:color w:val="5F666E"/>
-          <w:sz w:val="13"/>
+          <w:color w:val="D8E0E5"/>
+          <w:sz w:val="14"/>
         </w:rPr>
-        <w:t>Latest CV: yuanyuan-hu0319.github.io/cv-site/</w:t>
+        <w:t xml:space="preserve">  |  </w:t>
       </w:r>
+      <w:hyperlink r:id="rId12">
+        <w:r>
+          <w:rPr>
+            <w:rFonts w:ascii="Aptos" w:hAnsi="Aptos"/>
+            <w:color w:val="1E6A73"/>
+            <w:sz w:val="14"/>
+            <w:szCs w:val="14"/>
+            <w:u w:val="single"/>
+          </w:rPr>
+          <w:t>ORCID</w:t>
+        </w:r>
+      </w:hyperlink>
     </w:p>
     <w:sectPr>
-      <w:pgSz w:w="12240" w:h="15840"/>
-      <w:pgMar w:top="576" w:right="792" w:bottom="504" w:left="792" w:header="720" w:footer="720" w:gutter="0"/>
+      <w:footerReference w:type="default" r:id="rId9"/>
+      <w:pgSz w:w="11906" w:h="16838"/>
+      <w:pgMar w:top="547" w:right="835" w:bottom="576" w:left="835" w:header="288" w:footer="317" w:gutter="0"/>
       <w:cols w:space="720"/>
       <w:docGrid w:linePitch="360"/>
     </w:sectPr>
   </w:body>
 </w:document>
+</file>
+
+<file path=word/footer1.xml><?xml version="1.0" encoding="utf-8"?>
+<w:ftr xmlns:m="http://schemas.openxmlformats.org/officeDocument/2006/math" xmlns:mc="http://schemas.openxmlformats.org/markup-compatibility/2006" xmlns:mo="http://schemas.microsoft.com/office/mac/office/2008/main" xmlns:mv="urn:schemas-microsoft-com:mac:vml" xmlns:o="urn:schemas-microsoft-com:office:office" xmlns:r="http://schemas.openxmlformats.org/officeDocument/2006/relationships" xmlns:v="urn:schemas-microsoft-com:vml" xmlns:w10="urn:schemas-microsoft-com:office:word" xmlns:w14="http://schemas.microsoft.com/office/word/2010/wordml" xmlns:w="http://schemas.openxmlformats.org/wordprocessingml/2006/main" xmlns:wne="http://schemas.microsoft.com/office/word/2006/wordml" xmlns:wp14="http://schemas.microsoft.com/office/word/2010/wordprocessingDrawing" xmlns:wp="http://schemas.openxmlformats.org/drawingml/2006/wordprocessingDrawing" xmlns:wpc="http://schemas.microsoft.com/office/word/2010/wordprocessingCanvas" xmlns:wpg="http://schemas.microsoft.com/office/word/2010/wordprocessingGroup" xmlns:wpi="http://schemas.microsoft.com/office/word/2010/wordprocessingInk" xmlns:wps="http://schemas.microsoft.com/office/word/2010/wordprocessingShape" mc:Ignorable="w14 wp14">
+  <w:p>
+    <w:pPr>
+      <w:pStyle w:val="Footer"/>
+      <w:spacing w:before="0" w:after="0"/>
+      <w:jc w:val="center"/>
+    </w:pPr>
+    <w:r>
+      <w:rPr>
+        <w:rFonts w:ascii="Aptos" w:hAnsi="Aptos"/>
+        <w:b w:val="0"/>
+        <w:i w:val="0"/>
+        <w:color w:val="5C646D"/>
+        <w:sz w:val="14"/>
+      </w:rPr>
+      <w:t xml:space="preserve">Latest CV: </w:t>
+    </w:r>
+    <w:hyperlink r:id="rId1">
+      <w:r>
+        <w:rPr>
+          <w:rFonts w:ascii="Aptos" w:hAnsi="Aptos"/>
+          <w:color w:val="1E6A73"/>
+          <w:sz w:val="14"/>
+          <w:szCs w:val="14"/>
+          <w:u w:val="single"/>
+        </w:rPr>
+        <w:t>yuanyuan-hu0319.github.io/cv-site/</w:t>
+      </w:r>
+    </w:hyperlink>
+  </w:p>
+</w:ftr>
 </file>
 
 <file path=word/numbering.xml><?xml version="1.0" encoding="utf-8"?>
@@ -1928,8 +1745,12 @@
     <w:name w:val="Normal"/>
     <w:qFormat/>
     <w:rsid w:val="00FC693F"/>
+    <w:pPr>
+      <w:spacing w:after="60" w:line="259" w:lineRule="auto"/>
+    </w:pPr>
     <w:rPr>
-      <w:rFonts w:ascii="Calibri" w:hAnsi="Calibri"/>
+      <w:rFonts w:ascii="Aptos" w:hAnsi="Aptos"/>
+      <w:color w:val="20252B"/>
       <w:sz w:val="18"/>
     </w:rPr>
   </w:style>
@@ -2277,15 +2098,16 @@
       <w:pBdr>
         <w:bottom w:val="single" w:sz="8" w:space="4" w:color="4F81BD" w:themeColor="accent1"/>
       </w:pBdr>
-      <w:spacing w:after="300" w:line="240" w:lineRule="auto"/>
+      <w:spacing w:after="0" w:line="240" w:lineRule="auto"/>
       <w:contextualSpacing/>
     </w:pPr>
     <w:rPr>
-      <w:rFonts w:asciiTheme="majorHAnsi" w:eastAsiaTheme="majorEastAsia" w:hAnsiTheme="majorHAnsi" w:cstheme="majorBidi"/>
-      <w:color w:val="17365D" w:themeColor="text2" w:themeShade="BF"/>
+      <w:rFonts w:asciiTheme="majorHAnsi" w:eastAsiaTheme="majorEastAsia" w:hAnsiTheme="majorHAnsi" w:cstheme="majorBidi" w:ascii="Aptos Display" w:hAnsi="Aptos Display"/>
+      <w:b/>
+      <w:color w:val="193654"/>
       <w:spacing w:val="5"/>
       <w:kern w:val="28"/>
-      <w:sz w:val="52"/>
+      <w:sz w:val="44"/>
       <w:szCs w:val="52"/>
     </w:rPr>
   </w:style>
@@ -13614,6 +13436,19 @@
         <w:shd w:val="clear" w:color="auto" w:fill="FBCAA2" w:themeFill="accent6" w:themeFillTint="7F"/>
       </w:tcPr>
     </w:tblStylePr>
+  </w:style>
+  <w:style w:type="paragraph" w:customStyle="1" w:styleId="CVSection">
+    <w:name w:val="CV Section"/>
+    <w:pPr>
+      <w:keepNext/>
+      <w:spacing w:before="120" w:after="40"/>
+    </w:pPr>
+    <w:rPr>
+      <w:rFonts w:ascii="Aptos Display" w:hAnsi="Aptos Display"/>
+      <w:b/>
+      <w:color w:val="193654"/>
+      <w:sz w:val="20"/>
+    </w:rPr>
   </w:style>
 </w:styles>
 </file>

</xml_diff>

<commit_message>
Add collaborative publications to one-page CV
</commit_message>
<xml_diff>
--- a/Yuanyuan_Hu_CV.docx
+++ b/Yuanyuan_Hu_CV.docx
@@ -539,7 +539,7 @@
           <w:color w:val="193654"/>
           <w:sz w:val="20"/>
         </w:rPr>
-        <w:t>SELECTED AWARDS AND HONOURS</w:t>
+        <w:t>AWARDS AND HONOURS</w:t>
       </w:r>
     </w:p>
     <w:p>
@@ -723,7 +723,7 @@
           <w:color w:val="193654"/>
           <w:sz w:val="20"/>
         </w:rPr>
-        <w:t>SELECTED PUBLICATIONS</w:t>
+        <w:t>PUBLICATIONS</w:t>
       </w:r>
     </w:p>
     <w:p>
@@ -1288,6 +1288,384 @@
     </w:p>
     <w:p>
       <w:pPr>
+        <w:keepNext/>
+        <w:keepLines w:val="0"/>
+        <w:spacing w:before="40" w:after="20" w:line="240" w:lineRule="auto"/>
+        <w:jc w:val="left"/>
+      </w:pPr>
+      <w:r>
+        <w:rPr>
+          <w:rFonts w:ascii="Aptos Display" w:hAnsi="Aptos Display"/>
+          <w:b/>
+          <w:i w:val="0"/>
+          <w:color w:val="193654"/>
+          <w:sz w:val="17"/>
+        </w:rPr>
+        <w:t>Collaborative publications</w:t>
+      </w:r>
+    </w:p>
+    <w:p>
+      <w:pPr>
+        <w:keepLines/>
+        <w:spacing w:before="0" w:after="64" w:line="264" w:lineRule="auto"/>
+        <w:ind w:left="317" w:hanging="317"/>
+        <w:jc w:val="both"/>
+      </w:pPr>
+      <w:r>
+        <w:rPr>
+          <w:rFonts w:ascii="Aptos" w:hAnsi="Aptos"/>
+          <w:b/>
+          <w:i w:val="0"/>
+          <w:color w:val="1E6A73"/>
+          <w:sz w:val="17"/>
+        </w:rPr>
+        <w:t xml:space="preserve">1. </w:t>
+      </w:r>
+      <w:r>
+        <w:rPr>
+          <w:rFonts w:ascii="Aptos" w:hAnsi="Aptos"/>
+          <w:b w:val="0"/>
+          <w:i w:val="0"/>
+          <w:color w:val="20252B"/>
+          <w:sz w:val="17"/>
+        </w:rPr>
+        <w:t xml:space="preserve">Yuening Jin, Dang Zheng, Ruolei Gu, ... </w:t>
+      </w:r>
+      <w:r>
+        <w:rPr>
+          <w:rFonts w:ascii="Aptos" w:hAnsi="Aptos"/>
+          <w:b/>
+          <w:i w:val="0"/>
+          <w:color w:val="193654"/>
+          <w:sz w:val="17"/>
+        </w:rPr>
+        <w:t>Yuanyuan Hu</w:t>
+      </w:r>
+      <w:r>
+        <w:rPr>
+          <w:rFonts w:ascii="Aptos" w:hAnsi="Aptos"/>
+          <w:b w:val="0"/>
+          <w:i w:val="0"/>
+          <w:color w:val="20252B"/>
+          <w:sz w:val="17"/>
+        </w:rPr>
+        <w:t xml:space="preserve"> &amp; Yuan Zhou</w:t>
+      </w:r>
+      <w:r>
+        <w:rPr>
+          <w:rFonts w:ascii="Aptos" w:hAnsi="Aptos"/>
+          <w:b w:val="0"/>
+          <w:i w:val="0"/>
+          <w:color w:val="20252B"/>
+          <w:sz w:val="17"/>
+        </w:rPr>
+        <w:t xml:space="preserve"> (2025). </w:t>
+      </w:r>
+      <w:hyperlink r:id="rId19">
+        <w:r>
+          <w:rPr>
+            <w:rFonts w:ascii="Aptos" w:hAnsi="Aptos"/>
+            <w:color w:val="1E6A73"/>
+            <w:sz w:val="17"/>
+            <w:szCs w:val="17"/>
+            <w:u w:val="single"/>
+          </w:rPr>
+          <w:t>Substantial heritability underlies fairness norm adaptation capability and its neural basis</w:t>
+        </w:r>
+      </w:hyperlink>
+      <w:r>
+        <w:rPr>
+          <w:rFonts w:ascii="Aptos" w:hAnsi="Aptos"/>
+          <w:b w:val="0"/>
+          <w:i w:val="0"/>
+          <w:color w:val="20252B"/>
+          <w:sz w:val="17"/>
+        </w:rPr>
+        <w:t xml:space="preserve">. </w:t>
+      </w:r>
+      <w:r>
+        <w:rPr>
+          <w:rFonts w:ascii="Aptos" w:hAnsi="Aptos"/>
+          <w:b w:val="0"/>
+          <w:i/>
+          <w:color w:val="20252B"/>
+          <w:sz w:val="17"/>
+        </w:rPr>
+        <w:t>Advanced Science</w:t>
+      </w:r>
+      <w:r>
+        <w:rPr>
+          <w:rFonts w:ascii="Aptos" w:hAnsi="Aptos"/>
+          <w:b w:val="0"/>
+          <w:i w:val="0"/>
+          <w:color w:val="20252B"/>
+          <w:sz w:val="17"/>
+        </w:rPr>
+        <w:t>, 12(9), e2411070</w:t>
+      </w:r>
+      <w:r>
+        <w:rPr>
+          <w:rFonts w:ascii="Aptos" w:hAnsi="Aptos"/>
+          <w:b w:val="0"/>
+          <w:i w:val="0"/>
+          <w:color w:val="20252B"/>
+          <w:sz w:val="17"/>
+        </w:rPr>
+        <w:t>.</w:t>
+      </w:r>
+      <w:r>
+        <w:rPr>
+          <w:rFonts w:ascii="Aptos" w:hAnsi="Aptos"/>
+          <w:b w:val="0"/>
+          <w:i w:val="0"/>
+          <w:color w:val="5C646D"/>
+          <w:sz w:val="16"/>
+        </w:rPr>
+        <w:t xml:space="preserve">  SCI · Q1 · 5-year IF 16.3</w:t>
+      </w:r>
+    </w:p>
+    <w:p>
+      <w:pPr>
+        <w:keepLines/>
+        <w:spacing w:before="0" w:after="64" w:line="264" w:lineRule="auto"/>
+        <w:ind w:left="317" w:hanging="317"/>
+        <w:jc w:val="both"/>
+      </w:pPr>
+      <w:r>
+        <w:rPr>
+          <w:rFonts w:ascii="Aptos" w:hAnsi="Aptos"/>
+          <w:b/>
+          <w:i w:val="0"/>
+          <w:color w:val="1E6A73"/>
+          <w:sz w:val="17"/>
+        </w:rPr>
+        <w:t xml:space="preserve">2. </w:t>
+      </w:r>
+      <w:r>
+        <w:rPr>
+          <w:rFonts w:ascii="Aptos" w:hAnsi="Aptos"/>
+          <w:b w:val="0"/>
+          <w:i w:val="0"/>
+          <w:color w:val="20252B"/>
+          <w:sz w:val="17"/>
+        </w:rPr>
+        <w:t xml:space="preserve">Wei Li, Xue-rong Liu, Qianyu Zhang, ... </w:t>
+      </w:r>
+      <w:r>
+        <w:rPr>
+          <w:rFonts w:ascii="Aptos" w:hAnsi="Aptos"/>
+          <w:b/>
+          <w:i w:val="0"/>
+          <w:color w:val="193654"/>
+          <w:sz w:val="17"/>
+        </w:rPr>
+        <w:t>Yuanyuan Hu</w:t>
+      </w:r>
+      <w:r>
+        <w:rPr>
+          <w:rFonts w:ascii="Aptos" w:hAnsi="Aptos"/>
+          <w:b w:val="0"/>
+          <w:i w:val="0"/>
+          <w:color w:val="20252B"/>
+          <w:sz w:val="17"/>
+        </w:rPr>
+        <w:t>, et al.</w:t>
+      </w:r>
+      <w:r>
+        <w:rPr>
+          <w:rFonts w:ascii="Aptos" w:hAnsi="Aptos"/>
+          <w:b w:val="0"/>
+          <w:i w:val="0"/>
+          <w:color w:val="20252B"/>
+          <w:sz w:val="17"/>
+        </w:rPr>
+        <w:t xml:space="preserve"> (2025). </w:t>
+      </w:r>
+      <w:hyperlink r:id="rId20">
+        <w:r>
+          <w:rPr>
+            <w:rFonts w:ascii="Aptos" w:hAnsi="Aptos"/>
+            <w:color w:val="1E6A73"/>
+            <w:sz w:val="17"/>
+            <w:szCs w:val="17"/>
+            <w:u w:val="single"/>
+          </w:rPr>
+          <w:t>Implementation of primary psychological healthcare policy to address the risk of depression in underprivileged children and adolescents, in the entire lower-middle-economic-status city of China: an observational, multicenter, and single-arm cohort study</w:t>
+        </w:r>
+      </w:hyperlink>
+      <w:r>
+        <w:rPr>
+          <w:rFonts w:ascii="Aptos" w:hAnsi="Aptos"/>
+          <w:b w:val="0"/>
+          <w:i w:val="0"/>
+          <w:color w:val="20252B"/>
+          <w:sz w:val="17"/>
+        </w:rPr>
+        <w:t xml:space="preserve">. </w:t>
+      </w:r>
+      <w:r>
+        <w:rPr>
+          <w:rFonts w:ascii="Aptos" w:hAnsi="Aptos"/>
+          <w:b w:val="0"/>
+          <w:i/>
+          <w:color w:val="20252B"/>
+          <w:sz w:val="17"/>
+        </w:rPr>
+        <w:t>Depression and Anxiety</w:t>
+      </w:r>
+      <w:r>
+        <w:rPr>
+          <w:rFonts w:ascii="Aptos" w:hAnsi="Aptos"/>
+          <w:b w:val="0"/>
+          <w:i w:val="0"/>
+          <w:color w:val="20252B"/>
+          <w:sz w:val="17"/>
+        </w:rPr>
+        <w:t>, 2025(1), 5572365</w:t>
+      </w:r>
+      <w:r>
+        <w:rPr>
+          <w:rFonts w:ascii="Aptos" w:hAnsi="Aptos"/>
+          <w:b w:val="0"/>
+          <w:i w:val="0"/>
+          <w:color w:val="20252B"/>
+          <w:sz w:val="17"/>
+        </w:rPr>
+        <w:t>.</w:t>
+      </w:r>
+      <w:r>
+        <w:rPr>
+          <w:rFonts w:ascii="Aptos" w:hAnsi="Aptos"/>
+          <w:b w:val="0"/>
+          <w:i w:val="0"/>
+          <w:color w:val="5C646D"/>
+          <w:sz w:val="16"/>
+        </w:rPr>
+        <w:t xml:space="preserve">  SCI · Q1 · 5-year IF 6.3</w:t>
+      </w:r>
+    </w:p>
+    <w:p>
+      <w:pPr>
+        <w:keepLines/>
+        <w:spacing w:before="0" w:after="64" w:line="264" w:lineRule="auto"/>
+        <w:ind w:left="317" w:hanging="317"/>
+        <w:jc w:val="both"/>
+      </w:pPr>
+      <w:r>
+        <w:rPr>
+          <w:rFonts w:ascii="Aptos" w:hAnsi="Aptos"/>
+          <w:b/>
+          <w:i w:val="0"/>
+          <w:color w:val="1E6A73"/>
+          <w:sz w:val="17"/>
+        </w:rPr>
+        <w:t xml:space="preserve">3. </w:t>
+      </w:r>
+      <w:r>
+        <w:rPr>
+          <w:rFonts w:ascii="Aptos" w:hAnsi="Aptos"/>
+          <w:b w:val="0"/>
+          <w:i w:val="0"/>
+          <w:color w:val="20252B"/>
+          <w:sz w:val="17"/>
+        </w:rPr>
+        <w:t xml:space="preserve">Bowen Hu, Tongxi Yang, </w:t>
+      </w:r>
+      <w:r>
+        <w:rPr>
+          <w:rFonts w:ascii="Aptos" w:hAnsi="Aptos"/>
+          <w:b/>
+          <w:i w:val="0"/>
+          <w:color w:val="193654"/>
+          <w:sz w:val="17"/>
+        </w:rPr>
+        <w:t>Yuanyuan Hu</w:t>
+      </w:r>
+      <w:r>
+        <w:rPr>
+          <w:rFonts w:ascii="Aptos" w:hAnsi="Aptos"/>
+          <w:b w:val="0"/>
+          <w:i w:val="0"/>
+          <w:color w:val="20252B"/>
+          <w:sz w:val="17"/>
+        </w:rPr>
+        <w:t>, et al.</w:t>
+      </w:r>
+      <w:r>
+        <w:rPr>
+          <w:rFonts w:ascii="Aptos" w:hAnsi="Aptos"/>
+          <w:b w:val="0"/>
+          <w:i w:val="0"/>
+          <w:color w:val="20252B"/>
+          <w:sz w:val="17"/>
+        </w:rPr>
+        <w:t xml:space="preserve"> (2026). </w:t>
+      </w:r>
+      <w:hyperlink r:id="rId21">
+        <w:r>
+          <w:rPr>
+            <w:rFonts w:ascii="Aptos" w:hAnsi="Aptos"/>
+            <w:color w:val="1E6A73"/>
+            <w:sz w:val="17"/>
+            <w:szCs w:val="17"/>
+            <w:u w:val="single"/>
+          </w:rPr>
+          <w:t>Neurobehavioral Profiles of Inhibitory-Control Stratify Vulnerability and Resilience under Childhood Poverty</w:t>
+        </w:r>
+      </w:hyperlink>
+      <w:r>
+        <w:rPr>
+          <w:rFonts w:ascii="Aptos" w:hAnsi="Aptos"/>
+          <w:b w:val="0"/>
+          <w:i w:val="0"/>
+          <w:color w:val="20252B"/>
+          <w:sz w:val="17"/>
+        </w:rPr>
+        <w:t xml:space="preserve">. </w:t>
+      </w:r>
+      <w:r>
+        <w:rPr>
+          <w:rFonts w:ascii="Aptos" w:hAnsi="Aptos"/>
+          <w:b w:val="0"/>
+          <w:i/>
+          <w:color w:val="20252B"/>
+          <w:sz w:val="17"/>
+        </w:rPr>
+        <w:t>medRxiv</w:t>
+      </w:r>
+      <w:r>
+        <w:rPr>
+          <w:rFonts w:ascii="Aptos" w:hAnsi="Aptos"/>
+          <w:b w:val="0"/>
+          <w:i w:val="0"/>
+          <w:color w:val="20252B"/>
+          <w:sz w:val="17"/>
+        </w:rPr>
+        <w:t>, 2026-04</w:t>
+      </w:r>
+      <w:r>
+        <w:rPr>
+          <w:rFonts w:ascii="Aptos" w:hAnsi="Aptos"/>
+          <w:b w:val="0"/>
+          <w:i w:val="0"/>
+          <w:color w:val="20252B"/>
+          <w:sz w:val="17"/>
+        </w:rPr>
+        <w:t>.</w:t>
+      </w:r>
+      <w:r>
+        <w:rPr>
+          <w:rFonts w:ascii="Aptos" w:hAnsi="Aptos"/>
+          <w:b w:val="0"/>
+          <w:i w:val="0"/>
+          <w:color w:val="5C646D"/>
+          <w:sz w:val="16"/>
+        </w:rPr>
+        <w:t xml:space="preserve">  Preprint</w:t>
+      </w:r>
+    </w:p>
+    <w:p>
+      <w:pPr>
         <w:keepLines w:val="0"/>
         <w:spacing w:before="20" w:after="0" w:line="240" w:lineRule="auto"/>
         <w:jc w:val="center"/>
@@ -1300,9 +1678,9 @@
           <w:color w:val="5C646D"/>
           <w:sz w:val="14"/>
         </w:rPr>
-        <w:t xml:space="preserve"># Equal contribution. Full author lists and collaborative publications: </w:t>
+        <w:t xml:space="preserve"># Equal contribution. Full author lists: </w:t>
       </w:r>
-      <w:hyperlink r:id="rId19">
+      <w:hyperlink r:id="rId22">
         <w:r>
           <w:rPr>
             <w:rFonts w:ascii="Aptos" w:hAnsi="Aptos"/>

</xml_diff>